<commit_message>
Practical 1: add plugins task (Zimbabwe Boundaries) and second contact
</commit_message>
<xml_diff>
--- a/practicals/Zimgeo_Intro_GIS_QGIS_Practical_1.docx
+++ b/practicals/Zimgeo_Intro_GIS_QGIS_Practical_1.docx
@@ -121,7 +121,7 @@
           <w:sz w:val="22"/>
           <w:szCs w:val="22"/>
         </w:rPr>
-        <w:t xml:space="preserve">info@zimgeo.co.zw  |  www.zimgeo.co.zw</w:t>
+        <w:t xml:space="preserve">info@zimgeo.co.zw  |  kudzai@zimgeo.co.zw  |  www.zimgeo.co.zw</w:t>
       </w:r>
     </w:p>
     <w:p>
@@ -2853,6 +2853,9 @@
         <w:gridCol w:w="9360"/>
       </w:tblGrid>
       <w:tr>
+        <w:trPr>
+          <w:cantSplit/>
+        </w:trPr>
         <w:tc>
           <w:tcPr>
             <w:tcW w:type="dxa" w:w="9360"/>
@@ -3969,6 +3972,36 @@
     </w:p>
     <w:p>
       <w:pPr>
+        <w:pStyle w:val="ListParagraph"/>
+        <w:numPr>
+          <w:ilvl w:val="0"/>
+          <w:numId w:val="4"/>
+        </w:numPr>
+        <w:spacing w:after="60" w:line="276"/>
+      </w:pPr>
+      <w:r>
+        <w:rPr>
+          <w:rFonts w:ascii="Times New Roman" w:cs="Times New Roman" w:eastAsia="Times New Roman" w:hAnsi="Times New Roman"/>
+        </w:rPr>
+        <w:t xml:space="preserve">Install a QGIS plugin from a ZIP file and use the Zimgeo </w:t>
+      </w:r>
+      <w:r>
+        <w:rPr>
+          <w:rFonts w:ascii="Times New Roman" w:cs="Times New Roman" w:eastAsia="Times New Roman" w:hAnsi="Times New Roman"/>
+          <w:b/>
+          <w:bCs/>
+        </w:rPr>
+        <w:t xml:space="preserve">Zimbabwe Boundaries</w:t>
+      </w:r>
+      <w:r>
+        <w:rPr>
+          <w:rFonts w:ascii="Times New Roman" w:cs="Times New Roman" w:eastAsia="Times New Roman" w:hAnsi="Times New Roman"/>
+        </w:rPr>
+        <w:t xml:space="preserve"> plugin to get provinces, districts and wards.</w:t>
+      </w:r>
+    </w:p>
+    <w:p>
+      <w:pPr>
         <w:pStyle w:val="Heading1"/>
         <w:spacing w:after="120" w:before="280"/>
       </w:pPr>
@@ -4018,6 +4051,36 @@
     </w:p>
     <w:p>
       <w:pPr>
+        <w:pStyle w:val="ListParagraph"/>
+        <w:numPr>
+          <w:ilvl w:val="0"/>
+          <w:numId w:val="5"/>
+        </w:numPr>
+        <w:spacing w:after="60" w:line="276"/>
+      </w:pPr>
+      <w:r>
+        <w:rPr>
+          <w:rFonts w:ascii="Times New Roman" w:cs="Times New Roman" w:eastAsia="Times New Roman" w:hAnsi="Times New Roman"/>
+        </w:rPr>
+        <w:t xml:space="preserve">The Zimgeo </w:t>
+      </w:r>
+      <w:r>
+        <w:rPr>
+          <w:rFonts w:ascii="Times New Roman" w:cs="Times New Roman" w:eastAsia="Times New Roman" w:hAnsi="Times New Roman"/>
+          <w:b/>
+          <w:bCs/>
+        </w:rPr>
+        <w:t xml:space="preserve">Zimbabwe Boundaries</w:t>
+      </w:r>
+      <w:r>
+        <w:rPr>
+          <w:rFonts w:ascii="Times New Roman" w:cs="Times New Roman" w:eastAsia="Times New Roman" w:hAnsi="Times New Roman"/>
+        </w:rPr>
+        <w:t xml:space="preserve"> plugin for QGIS (free), used in Task 11.</w:t>
+      </w:r>
+    </w:p>
+    <w:p>
+      <w:pPr>
         <w:spacing w:after="80" w:before="160"/>
       </w:pPr>
       <w:r>
@@ -4044,7 +4107,7 @@
         </w:rPr>
         <w:t xml:space="preserve">All the data for this course is on the course page on GitHub: </w:t>
       </w:r>
-      <w:hyperlink w:history="1" r:id="rId6sakbeiyotcith5durhqt">
+      <w:hyperlink w:history="1" r:id="rIdvv5iss1uo7qf1iqonlqln">
         <w:r>
           <w:rPr>
             <w:rStyle w:val="Hyperlink"/>
@@ -4073,7 +4136,7 @@
         </w:rPr>
         <w:t xml:space="preserve"> (6.8 MB): </w:t>
       </w:r>
-      <w:hyperlink w:history="1" r:id="rIdnkyyzji_ddkbslqc356r6">
+      <w:hyperlink w:history="1" r:id="rIdct5fev0veeudlmlpddxpm">
         <w:r>
           <w:rPr>
             <w:rStyle w:val="Hyperlink"/>
@@ -5833,6 +5896,9 @@
         <w:gridCol w:w="9360"/>
       </w:tblGrid>
       <w:tr>
+        <w:trPr>
+          <w:cantSplit/>
+        </w:trPr>
         <w:tc>
           <w:tcPr>
             <w:tcW w:type="dxa" w:w="9360"/>
@@ -7998,6 +8064,9 @@
         <w:gridCol w:w="9360"/>
       </w:tblGrid>
       <w:tr>
+        <w:trPr>
+          <w:cantSplit/>
+        </w:trPr>
         <w:tc>
           <w:tcPr>
             <w:tcW w:type="dxa" w:w="9360"/>
@@ -8773,6 +8842,9 @@
         <w:gridCol w:w="9360"/>
       </w:tblGrid>
       <w:tr>
+        <w:trPr>
+          <w:cantSplit/>
+        </w:trPr>
         <w:tc>
           <w:tcPr>
             <w:tcW w:type="dxa" w:w="9360"/>
@@ -10505,6 +10577,1542 @@
     </w:p>
     <w:p>
       <w:pPr>
+        <w:pStyle w:val="Heading2"/>
+        <w:spacing w:after="100" w:before="240"/>
+      </w:pPr>
+      <w:r>
+        <w:rPr>
+          <w:rFonts w:ascii="Times New Roman" w:cs="Times New Roman" w:eastAsia="Times New Roman" w:hAnsi="Times New Roman"/>
+          <w:b/>
+          <w:bCs/>
+          <w:sz w:val="26"/>
+          <w:szCs w:val="26"/>
+        </w:rPr>
+        <w:t xml:space="preserve">Task 11: Extending QGIS with plugins</w:t>
+      </w:r>
+    </w:p>
+    <w:p>
+      <w:pPr>
+        <w:spacing w:after="120" w:line="276"/>
+        <w:jc w:val="both"/>
+      </w:pPr>
+      <w:r>
+        <w:rPr>
+          <w:rFonts w:ascii="Times New Roman" w:cs="Times New Roman" w:eastAsia="Times New Roman" w:hAnsi="Times New Roman"/>
+          <w:b/>
+          <w:bCs/>
+        </w:rPr>
+        <w:t xml:space="preserve">Plugins</w:t>
+      </w:r>
+      <w:r>
+        <w:rPr>
+          <w:rFonts w:ascii="Times New Roman" w:cs="Times New Roman" w:eastAsia="Times New Roman" w:hAnsi="Times New Roman"/>
+        </w:rPr>
+        <w:t xml:space="preserve"> are add-ons that give QGIS new tools. Most are written in Python by the QGIS community, and over 2 000 are available free of charge. Some examples you may find useful later in this course are:</w:t>
+      </w:r>
+    </w:p>
+    <w:p>
+      <w:pPr>
+        <w:pStyle w:val="ListParagraph"/>
+        <w:numPr>
+          <w:ilvl w:val="0"/>
+          <w:numId w:val="27"/>
+        </w:numPr>
+        <w:spacing w:after="60" w:line="276"/>
+      </w:pPr>
+      <w:r>
+        <w:rPr>
+          <w:rFonts w:ascii="Times New Roman" w:cs="Times New Roman" w:eastAsia="Times New Roman" w:hAnsi="Times New Roman"/>
+          <w:b/>
+          <w:bCs/>
+        </w:rPr>
+        <w:t xml:space="preserve">QuickMapServices</w:t>
+      </w:r>
+      <w:r>
+        <w:rPr>
+          <w:rFonts w:ascii="Times New Roman" w:cs="Times New Roman" w:eastAsia="Times New Roman" w:hAnsi="Times New Roman"/>
+        </w:rPr>
+        <w:t xml:space="preserve">: adds background maps such as OpenStreetMap and satellite imagery.</w:t>
+      </w:r>
+    </w:p>
+    <w:p>
+      <w:pPr>
+        <w:pStyle w:val="ListParagraph"/>
+        <w:numPr>
+          <w:ilvl w:val="0"/>
+          <w:numId w:val="27"/>
+        </w:numPr>
+        <w:spacing w:after="60" w:line="276"/>
+      </w:pPr>
+      <w:r>
+        <w:rPr>
+          <w:rFonts w:ascii="Times New Roman" w:cs="Times New Roman" w:eastAsia="Times New Roman" w:hAnsi="Times New Roman"/>
+          <w:b/>
+          <w:bCs/>
+        </w:rPr>
+        <w:t xml:space="preserve">qgis2web</w:t>
+      </w:r>
+      <w:r>
+        <w:rPr>
+          <w:rFonts w:ascii="Times New Roman" w:cs="Times New Roman" w:eastAsia="Times New Roman" w:hAnsi="Times New Roman"/>
+        </w:rPr>
+        <w:t xml:space="preserve">: turns a QGIS map into an interactive web map.</w:t>
+      </w:r>
+    </w:p>
+    <w:p>
+      <w:pPr>
+        <w:pStyle w:val="ListParagraph"/>
+        <w:numPr>
+          <w:ilvl w:val="0"/>
+          <w:numId w:val="27"/>
+        </w:numPr>
+        <w:spacing w:after="60" w:line="276"/>
+      </w:pPr>
+      <w:r>
+        <w:rPr>
+          <w:rFonts w:ascii="Times New Roman" w:cs="Times New Roman" w:eastAsia="Times New Roman" w:hAnsi="Times New Roman"/>
+          <w:b/>
+          <w:bCs/>
+        </w:rPr>
+        <w:t xml:space="preserve">Zimbabwe Boundaries</w:t>
+      </w:r>
+      <w:r>
+        <w:rPr>
+          <w:rFonts w:ascii="Times New Roman" w:cs="Times New Roman" w:eastAsia="Times New Roman" w:hAnsi="Times New Roman"/>
+        </w:rPr>
+        <w:t xml:space="preserve"> (by Zimgeo): Zimbabwe's country, province, district and ward boundaries in one click, without an internet connection.</w:t>
+      </w:r>
+    </w:p>
+    <w:p>
+      <w:pPr>
+        <w:spacing w:after="120" w:line="276"/>
+        <w:jc w:val="both"/>
+      </w:pPr>
+      <w:r>
+        <w:rPr>
+          <w:rFonts w:ascii="Times New Roman" w:cs="Times New Roman" w:eastAsia="Times New Roman" w:hAnsi="Times New Roman"/>
+        </w:rPr>
+        <w:t xml:space="preserve">Plugins from the official QGIS repository are installed from </w:t>
+      </w:r>
+      <w:r>
+        <w:rPr>
+          <w:rFonts w:ascii="Times New Roman" w:cs="Times New Roman" w:eastAsia="Times New Roman" w:hAnsi="Times New Roman"/>
+          <w:b/>
+          <w:bCs/>
+        </w:rPr>
+        <w:t xml:space="preserve">Plugins → Manage and Install Plugins...</w:t>
+      </w:r>
+      <w:r>
+        <w:rPr>
+          <w:rFonts w:ascii="Times New Roman" w:cs="Times New Roman" w:eastAsia="Times New Roman" w:hAnsi="Times New Roman"/>
+        </w:rPr>
+        <w:t xml:space="preserve">, which needs an internet connection. A plugin can also be supplied as a </w:t>
+      </w:r>
+      <w:r>
+        <w:rPr>
+          <w:rFonts w:ascii="Times New Roman" w:cs="Times New Roman" w:eastAsia="Times New Roman" w:hAnsi="Times New Roman"/>
+          <w:b/>
+          <w:bCs/>
+        </w:rPr>
+        <w:t xml:space="preserve">ZIP file</w:t>
+      </w:r>
+      <w:r>
+        <w:rPr>
+          <w:rFonts w:ascii="Times New Roman" w:cs="Times New Roman" w:eastAsia="Times New Roman" w:hAnsi="Times New Roman"/>
+        </w:rPr>
+        <w:t xml:space="preserve"> and installed from that file, which is how you will install the Zimbabwe Boundaries plugin.</w:t>
+      </w:r>
+    </w:p>
+    <w:p>
+      <w:pPr>
+        <w:spacing w:after="80" w:before="160"/>
+      </w:pPr>
+      <w:r>
+        <w:rPr>
+          <w:rFonts w:ascii="Times New Roman" w:cs="Times New Roman" w:eastAsia="Times New Roman" w:hAnsi="Times New Roman"/>
+          <w:b/>
+          <w:bCs/>
+          <w:i/>
+          <w:iCs/>
+          <w:sz w:val="24"/>
+          <w:szCs w:val="24"/>
+        </w:rPr>
+        <w:t xml:space="preserve">Installing the Zimbabwe Boundaries plugin</w:t>
+      </w:r>
+    </w:p>
+    <w:p>
+      <w:pPr>
+        <w:spacing w:after="120" w:line="276"/>
+        <w:jc w:val="both"/>
+      </w:pPr>
+      <w:r>
+        <w:rPr>
+          <w:rFonts w:ascii="Times New Roman" w:cs="Times New Roman" w:eastAsia="Times New Roman" w:hAnsi="Times New Roman"/>
+        </w:rPr>
+        <w:t xml:space="preserve">The plugin is on its own page on GitHub: </w:t>
+      </w:r>
+      <w:hyperlink w:history="1" r:id="rIdxxr3qp5uhjm4twuqypzqb">
+        <w:r>
+          <w:rPr>
+            <w:rStyle w:val="Hyperlink"/>
+            <w:rFonts w:ascii="Times New Roman" w:cs="Times New Roman" w:eastAsia="Times New Roman" w:hAnsi="Times New Roman"/>
+          </w:rPr>
+          <w:t xml:space="preserve">https://github.com/zimgeozw/qgis-zimbabwe-boundaries</w:t>
+        </w:r>
+      </w:hyperlink>
+      <w:r>
+        <w:rPr>
+          <w:rFonts w:ascii="Times New Roman" w:cs="Times New Roman" w:eastAsia="Times New Roman" w:hAnsi="Times New Roman"/>
+        </w:rPr>
+        <w:t xml:space="preserve">.</w:t>
+      </w:r>
+    </w:p>
+    <w:p>
+      <w:pPr>
+        <w:pStyle w:val="ListParagraph"/>
+        <w:numPr>
+          <w:ilvl w:val="0"/>
+          <w:numId w:val="28"/>
+        </w:numPr>
+        <w:spacing w:after="60" w:line="276"/>
+      </w:pPr>
+      <w:r>
+        <w:rPr>
+          <w:rFonts w:ascii="Times New Roman" w:cs="Times New Roman" w:eastAsia="Times New Roman" w:hAnsi="Times New Roman"/>
+        </w:rPr>
+        <w:t xml:space="preserve">Download </w:t>
+      </w:r>
+      <w:r>
+        <w:rPr>
+          <w:rFonts w:ascii="Times New Roman" w:cs="Times New Roman" w:eastAsia="Times New Roman" w:hAnsi="Times New Roman"/>
+          <w:b/>
+          <w:bCs/>
+        </w:rPr>
+        <w:t xml:space="preserve">zimbabwe_boundaries.zip</w:t>
+      </w:r>
+      <w:r>
+        <w:rPr>
+          <w:rFonts w:ascii="Times New Roman" w:cs="Times New Roman" w:eastAsia="Times New Roman" w:hAnsi="Times New Roman"/>
+        </w:rPr>
+        <w:t xml:space="preserve"> (25 MB) using the </w:t>
+      </w:r>
+      <w:r>
+        <w:rPr>
+          <w:rFonts w:ascii="Times New Roman" w:cs="Times New Roman" w:eastAsia="Times New Roman" w:hAnsi="Times New Roman"/>
+          <w:b/>
+          <w:bCs/>
+        </w:rPr>
+        <w:t xml:space="preserve">Download the plugin</w:t>
+      </w:r>
+      <w:r>
+        <w:rPr>
+          <w:rFonts w:ascii="Times New Roman" w:cs="Times New Roman" w:eastAsia="Times New Roman" w:hAnsi="Times New Roman"/>
+        </w:rPr>
+        <w:t xml:space="preserve"> link on the plugin page. </w:t>
+      </w:r>
+      <w:r>
+        <w:rPr>
+          <w:rFonts w:ascii="Times New Roman" w:cs="Times New Roman" w:eastAsia="Times New Roman" w:hAnsi="Times New Roman"/>
+          <w:b/>
+          <w:bCs/>
+        </w:rPr>
+        <w:t xml:space="preserve">Do not extract it</w:t>
+      </w:r>
+      <w:r>
+        <w:rPr>
+          <w:rFonts w:ascii="Times New Roman" w:cs="Times New Roman" w:eastAsia="Times New Roman" w:hAnsi="Times New Roman"/>
+        </w:rPr>
+        <w:t xml:space="preserve">: QGIS installs the ZIP file as it is.</w:t>
+      </w:r>
+    </w:p>
+    <w:p>
+      <w:pPr>
+        <w:pStyle w:val="ListParagraph"/>
+        <w:numPr>
+          <w:ilvl w:val="0"/>
+          <w:numId w:val="28"/>
+        </w:numPr>
+        <w:spacing w:after="60" w:line="276"/>
+      </w:pPr>
+      <w:r>
+        <w:rPr>
+          <w:rFonts w:ascii="Times New Roman" w:cs="Times New Roman" w:eastAsia="Times New Roman" w:hAnsi="Times New Roman"/>
+        </w:rPr>
+        <w:t xml:space="preserve">In QGIS, click </w:t>
+      </w:r>
+      <w:r>
+        <w:rPr>
+          <w:rFonts w:ascii="Times New Roman" w:cs="Times New Roman" w:eastAsia="Times New Roman" w:hAnsi="Times New Roman"/>
+          <w:b/>
+          <w:bCs/>
+        </w:rPr>
+        <w:t xml:space="preserve">Plugins → Manage and Install Plugins...</w:t>
+      </w:r>
+      <w:r>
+        <w:rPr>
+          <w:rFonts w:ascii="Times New Roman" w:cs="Times New Roman" w:eastAsia="Times New Roman" w:hAnsi="Times New Roman"/>
+        </w:rPr>
+        <w:t xml:space="preserve"> and click </w:t>
+      </w:r>
+      <w:r>
+        <w:rPr>
+          <w:rFonts w:ascii="Times New Roman" w:cs="Times New Roman" w:eastAsia="Times New Roman" w:hAnsi="Times New Roman"/>
+          <w:b/>
+          <w:bCs/>
+        </w:rPr>
+        <w:t xml:space="preserve">Install from ZIP</w:t>
+      </w:r>
+      <w:r>
+        <w:rPr>
+          <w:rFonts w:ascii="Times New Roman" w:cs="Times New Roman" w:eastAsia="Times New Roman" w:hAnsi="Times New Roman"/>
+        </w:rPr>
+        <w:t xml:space="preserve"> on the left (Figure 1.16).</w:t>
+      </w:r>
+    </w:p>
+    <w:p>
+      <w:pPr>
+        <w:pStyle w:val="ListParagraph"/>
+        <w:numPr>
+          <w:ilvl w:val="0"/>
+          <w:numId w:val="28"/>
+        </w:numPr>
+        <w:spacing w:after="60" w:line="276"/>
+      </w:pPr>
+      <w:r>
+        <w:rPr>
+          <w:rFonts w:ascii="Times New Roman" w:cs="Times New Roman" w:eastAsia="Times New Roman" w:hAnsi="Times New Roman"/>
+        </w:rPr>
+        <w:t xml:space="preserve">Click the </w:t>
+      </w:r>
+      <w:r>
+        <w:rPr>
+          <w:rFonts w:ascii="Times New Roman" w:cs="Times New Roman" w:eastAsia="Times New Roman" w:hAnsi="Times New Roman"/>
+          <w:b/>
+          <w:bCs/>
+        </w:rPr>
+        <w:t xml:space="preserve">...</w:t>
+      </w:r>
+      <w:r>
+        <w:rPr>
+          <w:rFonts w:ascii="Times New Roman" w:cs="Times New Roman" w:eastAsia="Times New Roman" w:hAnsi="Times New Roman"/>
+        </w:rPr>
+        <w:t xml:space="preserve"> button, choose the downloaded </w:t>
+      </w:r>
+      <w:r>
+        <w:rPr>
+          <w:rFonts w:ascii="Times New Roman" w:cs="Times New Roman" w:eastAsia="Times New Roman" w:hAnsi="Times New Roman"/>
+          <w:b/>
+          <w:bCs/>
+        </w:rPr>
+        <w:t xml:space="preserve">zimbabwe_boundaries.zip</w:t>
+      </w:r>
+      <w:r>
+        <w:rPr>
+          <w:rFonts w:ascii="Times New Roman" w:cs="Times New Roman" w:eastAsia="Times New Roman" w:hAnsi="Times New Roman"/>
+        </w:rPr>
+        <w:t xml:space="preserve"> and click </w:t>
+      </w:r>
+      <w:r>
+        <w:rPr>
+          <w:rFonts w:ascii="Times New Roman" w:cs="Times New Roman" w:eastAsia="Times New Roman" w:hAnsi="Times New Roman"/>
+          <w:b/>
+          <w:bCs/>
+        </w:rPr>
+        <w:t xml:space="preserve">Install Plugin</w:t>
+      </w:r>
+      <w:r>
+        <w:rPr>
+          <w:rFonts w:ascii="Times New Roman" w:cs="Times New Roman" w:eastAsia="Times New Roman" w:hAnsi="Times New Roman"/>
+        </w:rPr>
+        <w:t xml:space="preserve">.</w:t>
+      </w:r>
+    </w:p>
+    <w:p>
+      <w:pPr>
+        <w:pStyle w:val="ListParagraph"/>
+        <w:numPr>
+          <w:ilvl w:val="0"/>
+          <w:numId w:val="28"/>
+        </w:numPr>
+        <w:spacing w:after="60" w:line="276"/>
+      </w:pPr>
+      <w:r>
+        <w:rPr>
+          <w:rFonts w:ascii="Times New Roman" w:cs="Times New Roman" w:eastAsia="Times New Roman" w:hAnsi="Times New Roman"/>
+        </w:rPr>
+        <w:t xml:space="preserve">QGIS shows a security warning because the plugin does not come from the official repository. Click </w:t>
+      </w:r>
+      <w:r>
+        <w:rPr>
+          <w:rFonts w:ascii="Times New Roman" w:cs="Times New Roman" w:eastAsia="Times New Roman" w:hAnsi="Times New Roman"/>
+          <w:b/>
+          <w:bCs/>
+        </w:rPr>
+        <w:t xml:space="preserve">Yes</w:t>
+      </w:r>
+      <w:r>
+        <w:rPr>
+          <w:rFonts w:ascii="Times New Roman" w:cs="Times New Roman" w:eastAsia="Times New Roman" w:hAnsi="Times New Roman"/>
+        </w:rPr>
+        <w:t xml:space="preserve"> to continue. When QGIS reports that the plugin was installed successfully, click </w:t>
+      </w:r>
+      <w:r>
+        <w:rPr>
+          <w:rFonts w:ascii="Times New Roman" w:cs="Times New Roman" w:eastAsia="Times New Roman" w:hAnsi="Times New Roman"/>
+          <w:b/>
+          <w:bCs/>
+        </w:rPr>
+        <w:t xml:space="preserve">Close</w:t>
+      </w:r>
+      <w:r>
+        <w:rPr>
+          <w:rFonts w:ascii="Times New Roman" w:cs="Times New Roman" w:eastAsia="Times New Roman" w:hAnsi="Times New Roman"/>
+        </w:rPr>
+        <w:t xml:space="preserve">.</w:t>
+      </w:r>
+    </w:p>
+    <w:p>
+      <w:pPr>
+        <w:pStyle w:val="ListParagraph"/>
+        <w:numPr>
+          <w:ilvl w:val="0"/>
+          <w:numId w:val="28"/>
+        </w:numPr>
+        <w:spacing w:after="60" w:line="276"/>
+      </w:pPr>
+      <w:r>
+        <w:rPr>
+          <w:rFonts w:ascii="Times New Roman" w:cs="Times New Roman" w:eastAsia="Times New Roman" w:hAnsi="Times New Roman"/>
+        </w:rPr>
+        <w:t xml:space="preserve">A new button with a small map of Zimbabwe appears on the toolbar, and a new menu item appears under </w:t>
+      </w:r>
+      <w:r>
+        <w:rPr>
+          <w:rFonts w:ascii="Times New Roman" w:cs="Times New Roman" w:eastAsia="Times New Roman" w:hAnsi="Times New Roman"/>
+          <w:b/>
+          <w:bCs/>
+        </w:rPr>
+        <w:t xml:space="preserve">Vector → Zimbabwe boundaries</w:t>
+      </w:r>
+      <w:r>
+        <w:rPr>
+          <w:rFonts w:ascii="Times New Roman" w:cs="Times New Roman" w:eastAsia="Times New Roman" w:hAnsi="Times New Roman"/>
+        </w:rPr>
+        <w:t xml:space="preserve">.</w:t>
+      </w:r>
+    </w:p>
+    <w:p>
+      <w:pPr>
+        <w:spacing w:after="120" w:line="276"/>
+        <w:jc w:val="left"/>
+      </w:pPr>
+      <w:r>
+        <w:rPr>
+          <w:rFonts w:ascii="Times New Roman" w:cs="Times New Roman" w:eastAsia="Times New Roman" w:hAnsi="Times New Roman"/>
+        </w:rPr>
+        <w:t xml:space="preserve">Direct download link: </w:t>
+      </w:r>
+      <w:hyperlink w:history="1" r:id="rIdwjvwy7g8fgoeoti-v5679">
+        <w:r>
+          <w:rPr>
+            <w:rStyle w:val="Hyperlink"/>
+            <w:rFonts w:ascii="Times New Roman" w:cs="Times New Roman" w:eastAsia="Times New Roman" w:hAnsi="Times New Roman"/>
+          </w:rPr>
+          <w:t xml:space="preserve">https://github.com/zimgeozw/qgis-zimbabwe-boundaries/raw/main/download/zimbabwe_boundaries.zip</w:t>
+        </w:r>
+      </w:hyperlink>
+    </w:p>
+    <w:p>
+      <w:pPr>
+        <w:keepNext/>
+        <w:spacing w:after="60" w:before="120"/>
+        <w:jc w:val="center"/>
+      </w:pPr>
+      <w:r>
+        <w:drawing>
+          <wp:inline distT="0" distB="0" distL="0" distR="0">
+            <wp:extent cx="5143500" cy="3190875"/>
+            <wp:effectExtent t="0" r="0" b="0" l="0"/>
+            <wp:docPr id="1" name="f_pm_zip.png" descr="Plugins dialog, Install from ZIP page, with the downloaded plugin file selected" title="Figure 1.16"/>
+            <wp:cNvGraphicFramePr>
+              <a:graphicFrameLocks xmlns:a="http://schemas.openxmlformats.org/drawingml/2006/main" noChangeAspect="1"/>
+            </wp:cNvGraphicFramePr>
+            <a:graphic xmlns:a="http://schemas.openxmlformats.org/drawingml/2006/main">
+              <a:graphicData uri="http://schemas.openxmlformats.org/drawingml/2006/picture">
+                <pic:pic xmlns:pic="http://schemas.openxmlformats.org/drawingml/2006/picture">
+                  <pic:nvPicPr>
+                    <pic:cNvPr id="0" name="" descr=""/>
+                    <pic:cNvPicPr>
+                      <a:picLocks noChangeAspect="1" noChangeArrowheads="1"/>
+                    </pic:cNvPicPr>
+                  </pic:nvPicPr>
+                  <pic:blipFill>
+                    <a:blip r:embed="rId24" cstate="none"/>
+                    <a:srcRect/>
+                    <a:stretch>
+                      <a:fillRect/>
+                    </a:stretch>
+                  </pic:blipFill>
+                  <pic:spPr bwMode="auto">
+                    <a:xfrm>
+                      <a:off x="0" y="0"/>
+                      <a:ext cx="5143500" cy="3190875"/>
+                    </a:xfrm>
+                    <a:prstGeom prst="rect">
+                      <a:avLst/>
+                    </a:prstGeom>
+                  </pic:spPr>
+                </pic:pic>
+              </a:graphicData>
+            </a:graphic>
+          </wp:inline>
+        </w:drawing>
+      </w:r>
+    </w:p>
+    <w:p>
+      <w:pPr>
+        <w:spacing w:after="200"/>
+        <w:jc w:val="center"/>
+      </w:pPr>
+      <w:r>
+        <w:rPr>
+          <w:rFonts w:ascii="Times New Roman" w:cs="Times New Roman" w:eastAsia="Times New Roman" w:hAnsi="Times New Roman"/>
+          <w:i/>
+          <w:iCs/>
+          <w:sz w:val="22"/>
+          <w:szCs w:val="22"/>
+        </w:rPr>
+        <w:t xml:space="preserve">Figure 1.16: Plugins dialog, Install from ZIP page, with the downloaded plugin file selected</w:t>
+      </w:r>
+    </w:p>
+    <w:p>
+      <w:pPr>
+        <w:spacing w:after="80" w:before="160"/>
+      </w:pPr>
+      <w:r>
+        <w:rPr>
+          <w:rFonts w:ascii="Times New Roman" w:cs="Times New Roman" w:eastAsia="Times New Roman" w:hAnsi="Times New Roman"/>
+          <w:b/>
+          <w:bCs/>
+          <w:i/>
+          <w:iCs/>
+          <w:sz w:val="24"/>
+          <w:szCs w:val="24"/>
+        </w:rPr>
+        <w:t xml:space="preserve">Using the plugin</w:t>
+      </w:r>
+    </w:p>
+    <w:p>
+      <w:pPr>
+        <w:spacing w:after="120" w:line="276"/>
+        <w:jc w:val="both"/>
+      </w:pPr>
+      <w:r>
+        <w:rPr>
+          <w:rFonts w:ascii="Times New Roman" w:cs="Times New Roman" w:eastAsia="Times New Roman" w:hAnsi="Times New Roman"/>
+        </w:rPr>
+        <w:t xml:space="preserve">We will use the plugin to get the </w:t>
+      </w:r>
+      <w:r>
+        <w:rPr>
+          <w:rFonts w:ascii="Times New Roman" w:cs="Times New Roman" w:eastAsia="Times New Roman" w:hAnsi="Times New Roman"/>
+          <w:b/>
+          <w:bCs/>
+        </w:rPr>
+        <w:t xml:space="preserve">wards of Mutare district</w:t>
+      </w:r>
+      <w:r>
+        <w:rPr>
+          <w:rFonts w:ascii="Times New Roman" w:cs="Times New Roman" w:eastAsia="Times New Roman" w:hAnsi="Times New Roman"/>
+        </w:rPr>
+        <w:t xml:space="preserve"> in Manicaland, a level of detail that is not in the Session 1 data.</w:t>
+      </w:r>
+    </w:p>
+    <w:p>
+      <w:pPr>
+        <w:pStyle w:val="ListParagraph"/>
+        <w:numPr>
+          <w:ilvl w:val="0"/>
+          <w:numId w:val="29"/>
+        </w:numPr>
+        <w:spacing w:after="60" w:line="276"/>
+      </w:pPr>
+      <w:r>
+        <w:rPr>
+          <w:rFonts w:ascii="Times New Roman" w:cs="Times New Roman" w:eastAsia="Times New Roman" w:hAnsi="Times New Roman"/>
+        </w:rPr>
+        <w:t xml:space="preserve">Click the </w:t>
+      </w:r>
+      <w:r>
+        <w:rPr>
+          <w:rFonts w:ascii="Times New Roman" w:cs="Times New Roman" w:eastAsia="Times New Roman" w:hAnsi="Times New Roman"/>
+          <w:b/>
+          <w:bCs/>
+        </w:rPr>
+        <w:t xml:space="preserve">Zimbabwe boundaries</w:t>
+      </w:r>
+      <w:r>
+        <w:rPr>
+          <w:rFonts w:ascii="Times New Roman" w:cs="Times New Roman" w:eastAsia="Times New Roman" w:hAnsi="Times New Roman"/>
+        </w:rPr>
+        <w:t xml:space="preserve"> button on the toolbar (or </w:t>
+      </w:r>
+      <w:r>
+        <w:rPr>
+          <w:rFonts w:ascii="Times New Roman" w:cs="Times New Roman" w:eastAsia="Times New Roman" w:hAnsi="Times New Roman"/>
+          <w:b/>
+          <w:bCs/>
+        </w:rPr>
+        <w:t xml:space="preserve">Vector → Zimbabwe boundaries → Zimbabwe boundaries (levels 0 to 3)</w:t>
+      </w:r>
+      <w:r>
+        <w:rPr>
+          <w:rFonts w:ascii="Times New Roman" w:cs="Times New Roman" w:eastAsia="Times New Roman" w:hAnsi="Times New Roman"/>
+        </w:rPr>
+        <w:t xml:space="preserve">). The plugin window opens (Figure 1.17).</w:t>
+      </w:r>
+    </w:p>
+    <w:p>
+      <w:pPr>
+        <w:pStyle w:val="ListParagraph"/>
+        <w:numPr>
+          <w:ilvl w:val="0"/>
+          <w:numId w:val="29"/>
+        </w:numPr>
+        <w:spacing w:after="60" w:line="276"/>
+      </w:pPr>
+      <w:r>
+        <w:rPr>
+          <w:rFonts w:ascii="Times New Roman" w:cs="Times New Roman" w:eastAsia="Times New Roman" w:hAnsi="Times New Roman"/>
+        </w:rPr>
+        <w:t xml:space="preserve">Under </w:t>
+      </w:r>
+      <w:r>
+        <w:rPr>
+          <w:rFonts w:ascii="Times New Roman" w:cs="Times New Roman" w:eastAsia="Times New Roman" w:hAnsi="Times New Roman"/>
+          <w:b/>
+          <w:bCs/>
+        </w:rPr>
+        <w:t xml:space="preserve">Levels</w:t>
+      </w:r>
+      <w:r>
+        <w:rPr>
+          <w:rFonts w:ascii="Times New Roman" w:cs="Times New Roman" w:eastAsia="Times New Roman" w:hAnsi="Times New Roman"/>
+        </w:rPr>
+        <w:t xml:space="preserve">, tick </w:t>
+      </w:r>
+      <w:r>
+        <w:rPr>
+          <w:rFonts w:ascii="Times New Roman" w:cs="Times New Roman" w:eastAsia="Times New Roman" w:hAnsi="Times New Roman"/>
+          <w:b/>
+          <w:bCs/>
+        </w:rPr>
+        <w:t xml:space="preserve">Level 2: districts</w:t>
+      </w:r>
+      <w:r>
+        <w:rPr>
+          <w:rFonts w:ascii="Times New Roman" w:cs="Times New Roman" w:eastAsia="Times New Roman" w:hAnsi="Times New Roman"/>
+        </w:rPr>
+        <w:t xml:space="preserve"> and </w:t>
+      </w:r>
+      <w:r>
+        <w:rPr>
+          <w:rFonts w:ascii="Times New Roman" w:cs="Times New Roman" w:eastAsia="Times New Roman" w:hAnsi="Times New Roman"/>
+          <w:b/>
+          <w:bCs/>
+        </w:rPr>
+        <w:t xml:space="preserve">Level 3: wards, 2018 (old)</w:t>
+      </w:r>
+      <w:r>
+        <w:rPr>
+          <w:rFonts w:ascii="Times New Roman" w:cs="Times New Roman" w:eastAsia="Times New Roman" w:hAnsi="Times New Roman"/>
+        </w:rPr>
+        <w:t xml:space="preserve">, and untick the others. Read the orange note about the ward boundaries.</w:t>
+      </w:r>
+    </w:p>
+    <w:p>
+      <w:pPr>
+        <w:pStyle w:val="ListParagraph"/>
+        <w:numPr>
+          <w:ilvl w:val="0"/>
+          <w:numId w:val="29"/>
+        </w:numPr>
+        <w:spacing w:after="60" w:line="276"/>
+      </w:pPr>
+      <w:r>
+        <w:rPr>
+          <w:rFonts w:ascii="Times New Roman" w:cs="Times New Roman" w:eastAsia="Times New Roman" w:hAnsi="Times New Roman"/>
+        </w:rPr>
+        <w:t xml:space="preserve">Under </w:t>
+      </w:r>
+      <w:r>
+        <w:rPr>
+          <w:rFonts w:ascii="Times New Roman" w:cs="Times New Roman" w:eastAsia="Times New Roman" w:hAnsi="Times New Roman"/>
+          <w:b/>
+          <w:bCs/>
+        </w:rPr>
+        <w:t xml:space="preserve">Provinces</w:t>
+      </w:r>
+      <w:r>
+        <w:rPr>
+          <w:rFonts w:ascii="Times New Roman" w:cs="Times New Roman" w:eastAsia="Times New Roman" w:hAnsi="Times New Roman"/>
+        </w:rPr>
+        <w:t xml:space="preserve">, click </w:t>
+      </w:r>
+      <w:r>
+        <w:rPr>
+          <w:rFonts w:ascii="Times New Roman" w:cs="Times New Roman" w:eastAsia="Times New Roman" w:hAnsi="Times New Roman"/>
+          <w:b/>
+          <w:bCs/>
+        </w:rPr>
+        <w:t xml:space="preserve">Clear</w:t>
+      </w:r>
+      <w:r>
+        <w:rPr>
+          <w:rFonts w:ascii="Times New Roman" w:cs="Times New Roman" w:eastAsia="Times New Roman" w:hAnsi="Times New Roman"/>
+        </w:rPr>
+        <w:t xml:space="preserve"> and tick </w:t>
+      </w:r>
+      <w:r>
+        <w:rPr>
+          <w:rFonts w:ascii="Times New Roman" w:cs="Times New Roman" w:eastAsia="Times New Roman" w:hAnsi="Times New Roman"/>
+          <w:b/>
+          <w:bCs/>
+        </w:rPr>
+        <w:t xml:space="preserve">Manicaland</w:t>
+      </w:r>
+      <w:r>
+        <w:rPr>
+          <w:rFonts w:ascii="Times New Roman" w:cs="Times New Roman" w:eastAsia="Times New Roman" w:hAnsi="Times New Roman"/>
+        </w:rPr>
+        <w:t xml:space="preserve"> only. The </w:t>
+      </w:r>
+      <w:r>
+        <w:rPr>
+          <w:rFonts w:ascii="Times New Roman" w:cs="Times New Roman" w:eastAsia="Times New Roman" w:hAnsi="Times New Roman"/>
+          <w:b/>
+          <w:bCs/>
+        </w:rPr>
+        <w:t xml:space="preserve">Districts</w:t>
+      </w:r>
+      <w:r>
+        <w:rPr>
+          <w:rFonts w:ascii="Times New Roman" w:cs="Times New Roman" w:eastAsia="Times New Roman" w:hAnsi="Times New Roman"/>
+        </w:rPr>
+        <w:t xml:space="preserve"> list now shows only the districts of Manicaland.</w:t>
+      </w:r>
+    </w:p>
+    <w:p>
+      <w:pPr>
+        <w:pStyle w:val="ListParagraph"/>
+        <w:numPr>
+          <w:ilvl w:val="0"/>
+          <w:numId w:val="29"/>
+        </w:numPr>
+        <w:spacing w:after="60" w:line="276"/>
+      </w:pPr>
+      <w:r>
+        <w:rPr>
+          <w:rFonts w:ascii="Times New Roman" w:cs="Times New Roman" w:eastAsia="Times New Roman" w:hAnsi="Times New Roman"/>
+        </w:rPr>
+        <w:t xml:space="preserve">Under </w:t>
+      </w:r>
+      <w:r>
+        <w:rPr>
+          <w:rFonts w:ascii="Times New Roman" w:cs="Times New Roman" w:eastAsia="Times New Roman" w:hAnsi="Times New Roman"/>
+          <w:b/>
+          <w:bCs/>
+        </w:rPr>
+        <w:t xml:space="preserve">Districts</w:t>
+      </w:r>
+      <w:r>
+        <w:rPr>
+          <w:rFonts w:ascii="Times New Roman" w:cs="Times New Roman" w:eastAsia="Times New Roman" w:hAnsi="Times New Roman"/>
+        </w:rPr>
+        <w:t xml:space="preserve">, click </w:t>
+      </w:r>
+      <w:r>
+        <w:rPr>
+          <w:rFonts w:ascii="Times New Roman" w:cs="Times New Roman" w:eastAsia="Times New Roman" w:hAnsi="Times New Roman"/>
+          <w:b/>
+          <w:bCs/>
+        </w:rPr>
+        <w:t xml:space="preserve">Clear</w:t>
+      </w:r>
+      <w:r>
+        <w:rPr>
+          <w:rFonts w:ascii="Times New Roman" w:cs="Times New Roman" w:eastAsia="Times New Roman" w:hAnsi="Times New Roman"/>
+        </w:rPr>
+        <w:t xml:space="preserve"> and tick </w:t>
+      </w:r>
+      <w:r>
+        <w:rPr>
+          <w:rFonts w:ascii="Times New Roman" w:cs="Times New Roman" w:eastAsia="Times New Roman" w:hAnsi="Times New Roman"/>
+          <w:b/>
+          <w:bCs/>
+        </w:rPr>
+        <w:t xml:space="preserve">Mutare</w:t>
+      </w:r>
+      <w:r>
+        <w:rPr>
+          <w:rFonts w:ascii="Times New Roman" w:cs="Times New Roman" w:eastAsia="Times New Roman" w:hAnsi="Times New Roman"/>
+        </w:rPr>
+        <w:t xml:space="preserve"> only.</w:t>
+      </w:r>
+    </w:p>
+    <w:p>
+      <w:pPr>
+        <w:pStyle w:val="ListParagraph"/>
+        <w:numPr>
+          <w:ilvl w:val="0"/>
+          <w:numId w:val="29"/>
+        </w:numPr>
+        <w:spacing w:after="60" w:line="276"/>
+      </w:pPr>
+      <w:r>
+        <w:rPr>
+          <w:rFonts w:ascii="Times New Roman" w:cs="Times New Roman" w:eastAsia="Times New Roman" w:hAnsi="Times New Roman"/>
+        </w:rPr>
+        <w:t xml:space="preserve">Leave the </w:t>
+      </w:r>
+      <w:r>
+        <w:rPr>
+          <w:rFonts w:ascii="Times New Roman" w:cs="Times New Roman" w:eastAsia="Times New Roman" w:hAnsi="Times New Roman"/>
+          <w:b/>
+          <w:bCs/>
+        </w:rPr>
+        <w:t xml:space="preserve">Coordinate system</w:t>
+      </w:r>
+      <w:r>
+        <w:rPr>
+          <w:rFonts w:ascii="Times New Roman" w:cs="Times New Roman" w:eastAsia="Times New Roman" w:hAnsi="Times New Roman"/>
+        </w:rPr>
+        <w:t xml:space="preserve"> as </w:t>
+      </w:r>
+      <w:r>
+        <w:rPr>
+          <w:rFonts w:ascii="Times New Roman" w:cs="Times New Roman" w:eastAsia="Times New Roman" w:hAnsi="Times New Roman"/>
+          <w:b/>
+          <w:bCs/>
+        </w:rPr>
+        <w:t xml:space="preserve">EPSG:4326 - WGS 84</w:t>
+      </w:r>
+      <w:r>
+        <w:rPr>
+          <w:rFonts w:ascii="Times New Roman" w:cs="Times New Roman" w:eastAsia="Times New Roman" w:hAnsi="Times New Roman"/>
+        </w:rPr>
+        <w:t xml:space="preserve">. Under </w:t>
+      </w:r>
+      <w:r>
+        <w:rPr>
+          <w:rFonts w:ascii="Times New Roman" w:cs="Times New Roman" w:eastAsia="Times New Roman" w:hAnsi="Times New Roman"/>
+          <w:b/>
+          <w:bCs/>
+        </w:rPr>
+        <w:t xml:space="preserve">Output</w:t>
+      </w:r>
+      <w:r>
+        <w:rPr>
+          <w:rFonts w:ascii="Times New Roman" w:cs="Times New Roman" w:eastAsia="Times New Roman" w:hAnsi="Times New Roman"/>
+        </w:rPr>
+        <w:t xml:space="preserve">, tick </w:t>
+      </w:r>
+      <w:r>
+        <w:rPr>
+          <w:rFonts w:ascii="Times New Roman" w:cs="Times New Roman" w:eastAsia="Times New Roman" w:hAnsi="Times New Roman"/>
+          <w:b/>
+          <w:bCs/>
+        </w:rPr>
+        <w:t xml:space="preserve">Add to the map</w:t>
+      </w:r>
+      <w:r>
+        <w:rPr>
+          <w:rFonts w:ascii="Times New Roman" w:cs="Times New Roman" w:eastAsia="Times New Roman" w:hAnsi="Times New Roman"/>
+        </w:rPr>
+        <w:t xml:space="preserve"> and </w:t>
+      </w:r>
+      <w:r>
+        <w:rPr>
+          <w:rFonts w:ascii="Times New Roman" w:cs="Times New Roman" w:eastAsia="Times New Roman" w:hAnsi="Times New Roman"/>
+          <w:b/>
+          <w:bCs/>
+        </w:rPr>
+        <w:t xml:space="preserve">Show labels</w:t>
+      </w:r>
+      <w:r>
+        <w:rPr>
+          <w:rFonts w:ascii="Times New Roman" w:cs="Times New Roman" w:eastAsia="Times New Roman" w:hAnsi="Times New Roman"/>
+        </w:rPr>
+        <w:t xml:space="preserve">. Untick </w:t>
+      </w:r>
+      <w:r>
+        <w:rPr>
+          <w:rFonts w:ascii="Times New Roman" w:cs="Times New Roman" w:eastAsia="Times New Roman" w:hAnsi="Times New Roman"/>
+          <w:b/>
+          <w:bCs/>
+        </w:rPr>
+        <w:t xml:space="preserve">Save files to a folder</w:t>
+      </w:r>
+      <w:r>
+        <w:rPr>
+          <w:rFonts w:ascii="Times New Roman" w:cs="Times New Roman" w:eastAsia="Times New Roman" w:hAnsi="Times New Roman"/>
+        </w:rPr>
+        <w:t xml:space="preserve"> for now.</w:t>
+      </w:r>
+    </w:p>
+    <w:p>
+      <w:pPr>
+        <w:pStyle w:val="ListParagraph"/>
+        <w:numPr>
+          <w:ilvl w:val="0"/>
+          <w:numId w:val="29"/>
+        </w:numPr>
+        <w:spacing w:after="60" w:line="276"/>
+      </w:pPr>
+      <w:r>
+        <w:rPr>
+          <w:rFonts w:ascii="Times New Roman" w:cs="Times New Roman" w:eastAsia="Times New Roman" w:hAnsi="Times New Roman"/>
+        </w:rPr>
+        <w:t xml:space="preserve">Click </w:t>
+      </w:r>
+      <w:r>
+        <w:rPr>
+          <w:rFonts w:ascii="Times New Roman" w:cs="Times New Roman" w:eastAsia="Times New Roman" w:hAnsi="Times New Roman"/>
+          <w:b/>
+          <w:bCs/>
+        </w:rPr>
+        <w:t xml:space="preserve">Get boundaries</w:t>
+      </w:r>
+      <w:r>
+        <w:rPr>
+          <w:rFonts w:ascii="Times New Roman" w:cs="Times New Roman" w:eastAsia="Times New Roman" w:hAnsi="Times New Roman"/>
+        </w:rPr>
+        <w:t xml:space="preserve">. The district and its wards are added to the map in a group called </w:t>
+      </w:r>
+      <w:r>
+        <w:rPr>
+          <w:rFonts w:ascii="Times New Roman" w:cs="Times New Roman" w:eastAsia="Times New Roman" w:hAnsi="Times New Roman"/>
+          <w:b/>
+          <w:bCs/>
+        </w:rPr>
+        <w:t xml:space="preserve">Zimbabwe boundaries</w:t>
+      </w:r>
+      <w:r>
+        <w:rPr>
+          <w:rFonts w:ascii="Times New Roman" w:cs="Times New Roman" w:eastAsia="Times New Roman" w:hAnsi="Times New Roman"/>
+        </w:rPr>
+        <w:t xml:space="preserve"> (Figure 1.18). Zoom in to see the ward numbers.</w:t>
+      </w:r>
+    </w:p>
+    <w:p>
+      <w:pPr>
+        <w:keepNext/>
+        <w:spacing w:after="60" w:before="120"/>
+        <w:jc w:val="center"/>
+      </w:pPr>
+      <w:r>
+        <w:drawing>
+          <wp:inline distT="0" distB="0" distL="0" distR="0">
+            <wp:extent cx="5905500" cy="2381250"/>
+            <wp:effectExtent t="0" r="0" b="0" l="0"/>
+            <wp:docPr id="1" name="f_plugin_dialog.png" descr="The Zimbabwe Boundaries plugin set to add Mutare district and its wards" title="Figure 1.17"/>
+            <wp:cNvGraphicFramePr>
+              <a:graphicFrameLocks xmlns:a="http://schemas.openxmlformats.org/drawingml/2006/main" noChangeAspect="1"/>
+            </wp:cNvGraphicFramePr>
+            <a:graphic xmlns:a="http://schemas.openxmlformats.org/drawingml/2006/main">
+              <a:graphicData uri="http://schemas.openxmlformats.org/drawingml/2006/picture">
+                <pic:pic xmlns:pic="http://schemas.openxmlformats.org/drawingml/2006/picture">
+                  <pic:nvPicPr>
+                    <pic:cNvPr id="0" name="" descr=""/>
+                    <pic:cNvPicPr>
+                      <a:picLocks noChangeAspect="1" noChangeArrowheads="1"/>
+                    </pic:cNvPicPr>
+                  </pic:nvPicPr>
+                  <pic:blipFill>
+                    <a:blip r:embed="rId25" cstate="none"/>
+                    <a:srcRect/>
+                    <a:stretch>
+                      <a:fillRect/>
+                    </a:stretch>
+                  </pic:blipFill>
+                  <pic:spPr bwMode="auto">
+                    <a:xfrm>
+                      <a:off x="0" y="0"/>
+                      <a:ext cx="5905500" cy="2381250"/>
+                    </a:xfrm>
+                    <a:prstGeom prst="rect">
+                      <a:avLst/>
+                    </a:prstGeom>
+                  </pic:spPr>
+                </pic:pic>
+              </a:graphicData>
+            </a:graphic>
+          </wp:inline>
+        </w:drawing>
+      </w:r>
+    </w:p>
+    <w:p>
+      <w:pPr>
+        <w:spacing w:after="200"/>
+        <w:jc w:val="center"/>
+      </w:pPr>
+      <w:r>
+        <w:rPr>
+          <w:rFonts w:ascii="Times New Roman" w:cs="Times New Roman" w:eastAsia="Times New Roman" w:hAnsi="Times New Roman"/>
+          <w:i/>
+          <w:iCs/>
+          <w:sz w:val="22"/>
+          <w:szCs w:val="22"/>
+        </w:rPr>
+        <w:t xml:space="preserve">Figure 1.17: The Zimbabwe Boundaries plugin set to add Mutare district and its wards</w:t>
+      </w:r>
+    </w:p>
+    <w:p>
+      <w:pPr>
+        <w:keepNext/>
+        <w:spacing w:after="60" w:before="120"/>
+        <w:jc w:val="center"/>
+      </w:pPr>
+      <w:r>
+        <w:drawing>
+          <wp:inline distT="0" distB="0" distL="0" distR="0">
+            <wp:extent cx="5715000" cy="3571875"/>
+            <wp:effectExtent t="0" r="0" b="0" l="0"/>
+            <wp:docPr id="1" name="f_plugin_result.png" descr="The wards of Mutare district added by the plugin, labelled with their ward numbers" title="Figure 1.18"/>
+            <wp:cNvGraphicFramePr>
+              <a:graphicFrameLocks xmlns:a="http://schemas.openxmlformats.org/drawingml/2006/main" noChangeAspect="1"/>
+            </wp:cNvGraphicFramePr>
+            <a:graphic xmlns:a="http://schemas.openxmlformats.org/drawingml/2006/main">
+              <a:graphicData uri="http://schemas.openxmlformats.org/drawingml/2006/picture">
+                <pic:pic xmlns:pic="http://schemas.openxmlformats.org/drawingml/2006/picture">
+                  <pic:nvPicPr>
+                    <pic:cNvPr id="0" name="" descr=""/>
+                    <pic:cNvPicPr>
+                      <a:picLocks noChangeAspect="1" noChangeArrowheads="1"/>
+                    </pic:cNvPicPr>
+                  </pic:nvPicPr>
+                  <pic:blipFill>
+                    <a:blip r:embed="rId26" cstate="none"/>
+                    <a:srcRect/>
+                    <a:stretch>
+                      <a:fillRect/>
+                    </a:stretch>
+                  </pic:blipFill>
+                  <pic:spPr bwMode="auto">
+                    <a:xfrm>
+                      <a:off x="0" y="0"/>
+                      <a:ext cx="5715000" cy="3571875"/>
+                    </a:xfrm>
+                    <a:prstGeom prst="rect">
+                      <a:avLst/>
+                    </a:prstGeom>
+                  </pic:spPr>
+                </pic:pic>
+              </a:graphicData>
+            </a:graphic>
+          </wp:inline>
+        </w:drawing>
+      </w:r>
+    </w:p>
+    <w:p>
+      <w:pPr>
+        <w:spacing w:after="200"/>
+        <w:jc w:val="center"/>
+      </w:pPr>
+      <w:r>
+        <w:rPr>
+          <w:rFonts w:ascii="Times New Roman" w:cs="Times New Roman" w:eastAsia="Times New Roman" w:hAnsi="Times New Roman"/>
+          <w:i/>
+          <w:iCs/>
+          <w:sz w:val="22"/>
+          <w:szCs w:val="22"/>
+        </w:rPr>
+        <w:t xml:space="preserve">Figure 1.18: The wards of Mutare district added by the plugin, labelled with their ward numbers</w:t>
+      </w:r>
+    </w:p>
+    <w:tbl>
+      <w:tblPr>
+        <w:tblW w:type="dxa" w:w="9360"/>
+        <w:tblBorders>
+          <w:top w:val="single" w:color="auto" w:sz="4"/>
+          <w:left w:val="single" w:color="auto" w:sz="4"/>
+          <w:bottom w:val="single" w:color="auto" w:sz="4"/>
+          <w:right w:val="single" w:color="auto" w:sz="4"/>
+          <w:insideH w:val="single" w:color="auto" w:sz="4"/>
+          <w:insideV w:val="single" w:color="auto" w:sz="4"/>
+        </w:tblBorders>
+      </w:tblPr>
+      <w:tblGrid>
+        <w:gridCol w:w="9360"/>
+      </w:tblGrid>
+      <w:tr>
+        <w:trPr>
+          <w:cantSplit/>
+        </w:trPr>
+        <w:tc>
+          <w:tcPr>
+            <w:tcW w:type="dxa" w:w="9360"/>
+            <w:tcBorders>
+              <w:top w:val="single" w:color="808080" w:sz="4"/>
+              <w:left w:val="single" w:color="808080" w:sz="4"/>
+              <w:bottom w:val="single" w:color="808080" w:sz="4"/>
+              <w:right w:val="single" w:color="808080" w:sz="4"/>
+            </w:tcBorders>
+            <w:shd w:fill="F2F2F2" w:color="auto" w:val="clear"/>
+            <w:tcMar>
+              <w:top w:type="dxa" w:w="100"/>
+              <w:left w:type="dxa" w:w="140"/>
+              <w:bottom w:type="dxa" w:w="100"/>
+              <w:right w:type="dxa" w:w="140"/>
+            </w:tcMar>
+          </w:tcPr>
+          <w:p>
+            <w:pPr>
+              <w:spacing w:after="60"/>
+            </w:pPr>
+            <w:r>
+              <w:rPr>
+                <w:rFonts w:ascii="Times New Roman" w:cs="Times New Roman" w:eastAsia="Times New Roman" w:hAnsi="Times New Roman"/>
+                <w:b/>
+                <w:bCs/>
+                <w:sz w:val="22"/>
+                <w:szCs w:val="22"/>
+              </w:rPr>
+              <w:t xml:space="preserve">Saving the boundaries as shapefiles:</w:t>
+            </w:r>
+          </w:p>
+          <w:p>
+            <w:pPr>
+              <w:spacing w:after="40"/>
+            </w:pPr>
+            <w:r>
+              <w:rPr>
+                <w:rFonts w:ascii="Times New Roman" w:cs="Times New Roman" w:eastAsia="Times New Roman" w:hAnsi="Times New Roman"/>
+                <w:sz w:val="22"/>
+                <w:szCs w:val="22"/>
+              </w:rPr>
+              <w:t xml:space="preserve">Tick </w:t>
+            </w:r>
+            <w:r>
+              <w:rPr>
+                <w:rFonts w:ascii="Times New Roman" w:cs="Times New Roman" w:eastAsia="Times New Roman" w:hAnsi="Times New Roman"/>
+                <w:b/>
+                <w:bCs/>
+                <w:sz w:val="22"/>
+                <w:szCs w:val="22"/>
+              </w:rPr>
+              <w:t xml:space="preserve">Save files to a folder</w:t>
+            </w:r>
+            <w:r>
+              <w:rPr>
+                <w:rFonts w:ascii="Times New Roman" w:cs="Times New Roman" w:eastAsia="Times New Roman" w:hAnsi="Times New Roman"/>
+                <w:sz w:val="22"/>
+                <w:szCs w:val="22"/>
+              </w:rPr>
+              <w:t xml:space="preserve">, choose </w:t>
+            </w:r>
+            <w:r>
+              <w:rPr>
+                <w:rFonts w:ascii="Times New Roman" w:cs="Times New Roman" w:eastAsia="Times New Roman" w:hAnsi="Times New Roman"/>
+                <w:b/>
+                <w:bCs/>
+                <w:sz w:val="22"/>
+                <w:szCs w:val="22"/>
+              </w:rPr>
+              <w:t xml:space="preserve">Shapefile (.shp)</w:t>
+            </w:r>
+            <w:r>
+              <w:rPr>
+                <w:rFonts w:ascii="Times New Roman" w:cs="Times New Roman" w:eastAsia="Times New Roman" w:hAnsi="Times New Roman"/>
+                <w:sz w:val="22"/>
+                <w:szCs w:val="22"/>
+              </w:rPr>
+              <w:t xml:space="preserve"> as the </w:t>
+            </w:r>
+            <w:r>
+              <w:rPr>
+                <w:rFonts w:ascii="Times New Roman" w:cs="Times New Roman" w:eastAsia="Times New Roman" w:hAnsi="Times New Roman"/>
+                <w:b/>
+                <w:bCs/>
+                <w:sz w:val="22"/>
+                <w:szCs w:val="22"/>
+              </w:rPr>
+              <w:t xml:space="preserve">Format</w:t>
+            </w:r>
+            <w:r>
+              <w:rPr>
+                <w:rFonts w:ascii="Times New Roman" w:cs="Times New Roman" w:eastAsia="Times New Roman" w:hAnsi="Times New Roman"/>
+                <w:sz w:val="22"/>
+                <w:szCs w:val="22"/>
+              </w:rPr>
+              <w:t xml:space="preserve"> and choose a </w:t>
+            </w:r>
+            <w:r>
+              <w:rPr>
+                <w:rFonts w:ascii="Times New Roman" w:cs="Times New Roman" w:eastAsia="Times New Roman" w:hAnsi="Times New Roman"/>
+                <w:b/>
+                <w:bCs/>
+                <w:sz w:val="22"/>
+                <w:szCs w:val="22"/>
+              </w:rPr>
+              <w:t xml:space="preserve">Folder</w:t>
+            </w:r>
+            <w:r>
+              <w:rPr>
+                <w:rFonts w:ascii="Times New Roman" w:cs="Times New Roman" w:eastAsia="Times New Roman" w:hAnsi="Times New Roman"/>
+                <w:sz w:val="22"/>
+                <w:szCs w:val="22"/>
+              </w:rPr>
+              <w:t xml:space="preserve">. The plugin saves one shapefile per level, plus a text file with the data source. Tick </w:t>
+            </w:r>
+            <w:r>
+              <w:rPr>
+                <w:rFonts w:ascii="Times New Roman" w:cs="Times New Roman" w:eastAsia="Times New Roman" w:hAnsi="Times New Roman"/>
+                <w:b/>
+                <w:bCs/>
+                <w:sz w:val="22"/>
+                <w:szCs w:val="22"/>
+              </w:rPr>
+              <w:t xml:space="preserve">Pack into one zip file</w:t>
+            </w:r>
+            <w:r>
+              <w:rPr>
+                <w:rFonts w:ascii="Times New Roman" w:cs="Times New Roman" w:eastAsia="Times New Roman" w:hAnsi="Times New Roman"/>
+                <w:sz w:val="22"/>
+                <w:szCs w:val="22"/>
+              </w:rPr>
+              <w:t xml:space="preserve"> to share them easily.</w:t>
+            </w:r>
+          </w:p>
+          <w:p>
+            <w:pPr>
+              <w:spacing w:after="40"/>
+            </w:pPr>
+            <w:r>
+              <w:rPr>
+                <w:rFonts w:ascii="Times New Roman" w:cs="Times New Roman" w:eastAsia="Times New Roman" w:hAnsi="Times New Roman"/>
+                <w:sz w:val="22"/>
+                <w:szCs w:val="22"/>
+              </w:rPr>
+              <w:t xml:space="preserve">Choose </w:t>
+            </w:r>
+            <w:r>
+              <w:rPr>
+                <w:rFonts w:ascii="Times New Roman" w:cs="Times New Roman" w:eastAsia="Times New Roman" w:hAnsi="Times New Roman"/>
+                <w:b/>
+                <w:bCs/>
+                <w:sz w:val="22"/>
+                <w:szCs w:val="22"/>
+              </w:rPr>
+              <w:t xml:space="preserve">UTM 35S</w:t>
+            </w:r>
+            <w:r>
+              <w:rPr>
+                <w:rFonts w:ascii="Times New Roman" w:cs="Times New Roman" w:eastAsia="Times New Roman" w:hAnsi="Times New Roman"/>
+                <w:sz w:val="22"/>
+                <w:szCs w:val="22"/>
+              </w:rPr>
+              <w:t xml:space="preserve"> or </w:t>
+            </w:r>
+            <w:r>
+              <w:rPr>
+                <w:rFonts w:ascii="Times New Roman" w:cs="Times New Roman" w:eastAsia="Times New Roman" w:hAnsi="Times New Roman"/>
+                <w:b/>
+                <w:bCs/>
+                <w:sz w:val="22"/>
+                <w:szCs w:val="22"/>
+              </w:rPr>
+              <w:t xml:space="preserve">UTM 36S</w:t>
+            </w:r>
+            <w:r>
+              <w:rPr>
+                <w:rFonts w:ascii="Times New Roman" w:cs="Times New Roman" w:eastAsia="Times New Roman" w:hAnsi="Times New Roman"/>
+                <w:sz w:val="22"/>
+                <w:szCs w:val="22"/>
+              </w:rPr>
+              <w:t xml:space="preserve"> under </w:t>
+            </w:r>
+            <w:r>
+              <w:rPr>
+                <w:rFonts w:ascii="Times New Roman" w:cs="Times New Roman" w:eastAsia="Times New Roman" w:hAnsi="Times New Roman"/>
+                <w:b/>
+                <w:bCs/>
+                <w:sz w:val="22"/>
+                <w:szCs w:val="22"/>
+              </w:rPr>
+              <w:t xml:space="preserve">Coordinate system</w:t>
+            </w:r>
+            <w:r>
+              <w:rPr>
+                <w:rFonts w:ascii="Times New Roman" w:cs="Times New Roman" w:eastAsia="Times New Roman" w:hAnsi="Times New Roman"/>
+                <w:sz w:val="22"/>
+                <w:szCs w:val="22"/>
+              </w:rPr>
+              <w:t xml:space="preserve"> if you need the boundaries in metres.</w:t>
+            </w:r>
+          </w:p>
+        </w:tc>
+      </w:tr>
+    </w:tbl>
+    <w:p>
+      <w:pPr>
+        <w:spacing w:after="60"/>
+      </w:pPr>
+    </w:p>
+    <w:tbl>
+      <w:tblPr>
+        <w:tblW w:type="dxa" w:w="9360"/>
+        <w:tblBorders>
+          <w:top w:val="single" w:color="auto" w:sz="4"/>
+          <w:left w:val="single" w:color="auto" w:sz="4"/>
+          <w:bottom w:val="single" w:color="auto" w:sz="4"/>
+          <w:right w:val="single" w:color="auto" w:sz="4"/>
+          <w:insideH w:val="single" w:color="auto" w:sz="4"/>
+          <w:insideV w:val="single" w:color="auto" w:sz="4"/>
+        </w:tblBorders>
+      </w:tblPr>
+      <w:tblGrid>
+        <w:gridCol w:w="9360"/>
+      </w:tblGrid>
+      <w:tr>
+        <w:trPr>
+          <w:cantSplit/>
+        </w:trPr>
+        <w:tc>
+          <w:tcPr>
+            <w:tcW w:type="dxa" w:w="9360"/>
+            <w:tcBorders>
+              <w:top w:val="single" w:color="808080" w:sz="4"/>
+              <w:left w:val="single" w:color="808080" w:sz="4"/>
+              <w:bottom w:val="single" w:color="808080" w:sz="4"/>
+              <w:right w:val="single" w:color="808080" w:sz="4"/>
+            </w:tcBorders>
+            <w:shd w:fill="F2F2F2" w:color="auto" w:val="clear"/>
+            <w:tcMar>
+              <w:top w:type="dxa" w:w="100"/>
+              <w:left w:type="dxa" w:w="140"/>
+              <w:bottom w:type="dxa" w:w="100"/>
+              <w:right w:type="dxa" w:w="140"/>
+            </w:tcMar>
+          </w:tcPr>
+          <w:p>
+            <w:pPr>
+              <w:spacing w:after="60"/>
+            </w:pPr>
+            <w:r>
+              <w:rPr>
+                <w:rFonts w:ascii="Times New Roman" w:cs="Times New Roman" w:eastAsia="Times New Roman" w:hAnsi="Times New Roman"/>
+                <w:b/>
+                <w:bCs/>
+                <w:sz w:val="22"/>
+                <w:szCs w:val="22"/>
+              </w:rPr>
+              <w:t xml:space="preserve">Note:</w:t>
+            </w:r>
+          </w:p>
+          <w:p>
+            <w:pPr>
+              <w:spacing w:after="40"/>
+            </w:pPr>
+            <w:r>
+              <w:rPr>
+                <w:rFonts w:ascii="Times New Roman" w:cs="Times New Roman" w:eastAsia="Times New Roman" w:hAnsi="Times New Roman"/>
+                <w:sz w:val="22"/>
+                <w:szCs w:val="22"/>
+              </w:rPr>
+              <w:t xml:space="preserve">The ward boundaries in the plugin are the </w:t>
+            </w:r>
+            <w:r>
+              <w:rPr>
+                <w:rFonts w:ascii="Times New Roman" w:cs="Times New Roman" w:eastAsia="Times New Roman" w:hAnsi="Times New Roman"/>
+                <w:b/>
+                <w:bCs/>
+                <w:sz w:val="22"/>
+                <w:szCs w:val="22"/>
+              </w:rPr>
+              <w:t xml:space="preserve">2018</w:t>
+            </w:r>
+            <w:r>
+              <w:rPr>
+                <w:rFonts w:ascii="Times New Roman" w:cs="Times New Roman" w:eastAsia="Times New Roman" w:hAnsi="Times New Roman"/>
+                <w:sz w:val="22"/>
+                <w:szCs w:val="22"/>
+              </w:rPr>
+              <w:t xml:space="preserve"> wards from ZIMSTAT and OCHA. They are older than the latest ward delimitation, so check them against current Zimbabwe Electoral Commission ward maps before using them for electoral or ward-level planning work. Always credit the data source on your maps.</w:t>
+            </w:r>
+          </w:p>
+        </w:tc>
+      </w:tr>
+    </w:tbl>
+    <w:p>
+      <w:pPr>
+        <w:spacing w:after="60"/>
+      </w:pPr>
+    </w:p>
+    <w:p>
+      <w:pPr>
+        <w:pStyle w:val="ListParagraph"/>
+        <w:numPr>
+          <w:ilvl w:val="0"/>
+          <w:numId w:val="30"/>
+        </w:numPr>
+        <w:spacing w:after="60" w:line="276"/>
+      </w:pPr>
+      <w:r>
+        <w:rPr>
+          <w:rFonts w:ascii="Times New Roman" w:cs="Times New Roman" w:eastAsia="Times New Roman" w:hAnsi="Times New Roman"/>
+          <w:i/>
+          <w:iCs/>
+        </w:rPr>
+        <w:t xml:space="preserve">How many wards does Mutare district have? (Hint: open the attribute table of the wards layer.) Which fields does the ward layer have that the Session 1 districts layer does not?</w:t>
+      </w:r>
+    </w:p>
+    <w:p>
+      <w:pPr>
+        <w:pStyle w:val="ListParagraph"/>
+        <w:numPr>
+          <w:ilvl w:val="0"/>
+          <w:numId w:val="30"/>
+        </w:numPr>
+        <w:spacing w:after="60" w:line="276"/>
+      </w:pPr>
+      <w:r>
+        <w:rPr>
+          <w:rFonts w:ascii="Times New Roman" w:cs="Times New Roman" w:eastAsia="Times New Roman" w:hAnsi="Times New Roman"/>
+          <w:i/>
+          <w:iCs/>
+        </w:rPr>
+        <w:t xml:space="preserve">Use the plugin to save the districts of </w:t>
+      </w:r>
+      <w:r>
+        <w:rPr>
+          <w:rFonts w:ascii="Times New Roman" w:cs="Times New Roman" w:eastAsia="Times New Roman" w:hAnsi="Times New Roman"/>
+          <w:b/>
+          <w:bCs/>
+          <w:i/>
+          <w:iCs/>
+        </w:rPr>
+        <w:t xml:space="preserve">Masvingo</w:t>
+      </w:r>
+      <w:r>
+        <w:rPr>
+          <w:rFonts w:ascii="Times New Roman" w:cs="Times New Roman" w:eastAsia="Times New Roman" w:hAnsi="Times New Roman"/>
+          <w:i/>
+          <w:iCs/>
+        </w:rPr>
+        <w:t xml:space="preserve"> province as a shapefile in </w:t>
+      </w:r>
+      <w:r>
+        <w:rPr>
+          <w:rFonts w:ascii="Times New Roman" w:cs="Times New Roman" w:eastAsia="Times New Roman" w:hAnsi="Times New Roman"/>
+          <w:b/>
+          <w:bCs/>
+          <w:i/>
+          <w:iCs/>
+        </w:rPr>
+        <w:t xml:space="preserve">UTM 36S</w:t>
+      </w:r>
+      <w:r>
+        <w:rPr>
+          <w:rFonts w:ascii="Times New Roman" w:cs="Times New Roman" w:eastAsia="Times New Roman" w:hAnsi="Times New Roman"/>
+          <w:i/>
+          <w:iCs/>
+        </w:rPr>
+        <w:t xml:space="preserve">. Add the saved file to QGIS and check its CRS in </w:t>
+      </w:r>
+      <w:r>
+        <w:rPr>
+          <w:rFonts w:ascii="Times New Roman" w:cs="Times New Roman" w:eastAsia="Times New Roman" w:hAnsi="Times New Roman"/>
+          <w:b/>
+          <w:bCs/>
+          <w:i/>
+          <w:iCs/>
+        </w:rPr>
+        <w:t xml:space="preserve">Layer Properties → Information</w:t>
+      </w:r>
+      <w:r>
+        <w:rPr>
+          <w:rFonts w:ascii="Times New Roman" w:cs="Times New Roman" w:eastAsia="Times New Roman" w:hAnsi="Times New Roman"/>
+          <w:i/>
+          <w:iCs/>
+        </w:rPr>
+        <w:t xml:space="preserve">.</w:t>
+      </w:r>
+    </w:p>
+    <w:p>
+      <w:pPr>
+        <w:pStyle w:val="ListParagraph"/>
+        <w:numPr>
+          <w:ilvl w:val="0"/>
+          <w:numId w:val="30"/>
+        </w:numPr>
+        <w:spacing w:after="60" w:line="276"/>
+      </w:pPr>
+      <w:r>
+        <w:rPr>
+          <w:rFonts w:ascii="Times New Roman" w:cs="Times New Roman" w:eastAsia="Times New Roman" w:hAnsi="Times New Roman"/>
+          <w:i/>
+          <w:iCs/>
+        </w:rPr>
+        <w:t xml:space="preserve">Use the identify tool on one ward. What is its </w:t>
+      </w:r>
+      <w:r>
+        <w:rPr>
+          <w:rFonts w:ascii="Times New Roman" w:cs="Times New Roman" w:eastAsia="Times New Roman" w:hAnsi="Times New Roman"/>
+          <w:b/>
+          <w:bCs/>
+          <w:i/>
+          <w:iCs/>
+        </w:rPr>
+        <w:t xml:space="preserve">ward_pcode</w:t>
+      </w:r>
+      <w:r>
+        <w:rPr>
+          <w:rFonts w:ascii="Times New Roman" w:cs="Times New Roman" w:eastAsia="Times New Roman" w:hAnsi="Times New Roman"/>
+          <w:i/>
+          <w:iCs/>
+        </w:rPr>
+        <w:t xml:space="preserve">? Why are codes like these more reliable than names when joining tables from different sources?</w:t>
+      </w:r>
+    </w:p>
+    <w:p>
+      <w:pPr>
+        <w:pStyle w:val="ListParagraph"/>
+        <w:numPr>
+          <w:ilvl w:val="0"/>
+          <w:numId w:val="30"/>
+        </w:numPr>
+        <w:spacing w:after="60" w:line="276"/>
+      </w:pPr>
+      <w:r>
+        <w:rPr>
+          <w:rFonts w:ascii="Times New Roman" w:cs="Times New Roman" w:eastAsia="Times New Roman" w:hAnsi="Times New Roman"/>
+          <w:i/>
+          <w:iCs/>
+        </w:rPr>
+        <w:t xml:space="preserve">Go to </w:t>
+      </w:r>
+      <w:r>
+        <w:rPr>
+          <w:rFonts w:ascii="Times New Roman" w:cs="Times New Roman" w:eastAsia="Times New Roman" w:hAnsi="Times New Roman"/>
+          <w:b/>
+          <w:bCs/>
+          <w:i/>
+          <w:iCs/>
+        </w:rPr>
+        <w:t xml:space="preserve">Plugins → Manage and Install Plugins... → Installed</w:t>
+      </w:r>
+      <w:r>
+        <w:rPr>
+          <w:rFonts w:ascii="Times New Roman" w:cs="Times New Roman" w:eastAsia="Times New Roman" w:hAnsi="Times New Roman"/>
+          <w:i/>
+          <w:iCs/>
+        </w:rPr>
+        <w:t xml:space="preserve">. Where can you switch the Zimbabwe Boundaries plugin off, and where can you uninstall it?</w:t>
+      </w:r>
+    </w:p>
+    <w:p>
+      <w:pPr>
         <w:pStyle w:val="Heading1"/>
         <w:spacing w:after="120" w:before="280"/>
       </w:pPr>
@@ -10570,7 +12178,7 @@
         </w:rPr>
         <w:t xml:space="preserve">All course data and updates are on the course page: </w:t>
       </w:r>
-      <w:hyperlink w:history="1" r:id="rIdhsfk7mlrjlkkvaixgjdgu">
+      <w:hyperlink w:history="1" r:id="rId7uqhc-lvobgzxwyxc_fu4">
         <w:r>
           <w:rPr>
             <w:rStyle w:val="Hyperlink"/>
@@ -10585,13 +12193,28 @@
         </w:rPr>
         <w:t xml:space="preserve">. For questions, contact the Zimgeo team at </w:t>
       </w:r>
-      <w:hyperlink w:history="1" r:id="rIdd9ynca6uu57v4x2axo7xb">
+      <w:hyperlink w:history="1" r:id="rIdp4_etw9c5ilvsldw0sa4-">
         <w:r>
           <w:rPr>
             <w:rStyle w:val="Hyperlink"/>
             <w:rFonts w:ascii="Times New Roman" w:cs="Times New Roman" w:eastAsia="Times New Roman" w:hAnsi="Times New Roman"/>
           </w:rPr>
           <w:t xml:space="preserve">info@zimgeo.co.zw</w:t>
+        </w:r>
+      </w:hyperlink>
+      <w:r>
+        <w:rPr>
+          <w:rFonts w:ascii="Times New Roman" w:cs="Times New Roman" w:eastAsia="Times New Roman" w:hAnsi="Times New Roman"/>
+        </w:rPr>
+        <w:t xml:space="preserve"> or </w:t>
+      </w:r>
+      <w:hyperlink w:history="1" r:id="rIdqgxxwda3siewtiwrjho9w">
+        <w:r>
+          <w:rPr>
+            <w:rStyle w:val="Hyperlink"/>
+            <w:rFonts w:ascii="Times New Roman" w:cs="Times New Roman" w:eastAsia="Times New Roman" w:hAnsi="Times New Roman"/>
+          </w:rPr>
+          <w:t xml:space="preserve">kudzai@zimgeo.co.zw</w:t>
         </w:r>
       </w:hyperlink>
       <w:r>
@@ -11155,6 +12778,58 @@
       <w:pPr>
         <w:ind w:left="720" w:hanging="360"/>
       </w:pPr>
+    </w:lvl>
+  </w:abstractNum>
+  <w:abstractNum w:abstractNumId="27" w15:restartNumberingAfterBreak="0">
+    <w:multiLevelType w:val="hybridMultilevel"/>
+    <w:lvl w:ilvl="0" w15:tentative="1">
+      <w:start w:val="1"/>
+      <w:numFmt w:val="bullet"/>
+      <w:lvlText w:val="•"/>
+      <w:lvlJc w:val="left"/>
+      <w:pPr>
+        <w:ind w:left="720" w:hanging="360"/>
+      </w:pPr>
+    </w:lvl>
+  </w:abstractNum>
+  <w:abstractNum w:abstractNumId="28" w15:restartNumberingAfterBreak="0">
+    <w:multiLevelType w:val="hybridMultilevel"/>
+    <w:lvl w:ilvl="0" w15:tentative="1">
+      <w:start w:val="1"/>
+      <w:numFmt w:val="decimal"/>
+      <w:lvlText w:val="%1."/>
+      <w:lvlJc w:val="left"/>
+      <w:pPr>
+        <w:ind w:left="720" w:hanging="360"/>
+      </w:pPr>
+    </w:lvl>
+  </w:abstractNum>
+  <w:abstractNum w:abstractNumId="29" w15:restartNumberingAfterBreak="0">
+    <w:multiLevelType w:val="hybridMultilevel"/>
+    <w:lvl w:ilvl="0" w15:tentative="1">
+      <w:start w:val="1"/>
+      <w:numFmt w:val="decimal"/>
+      <w:lvlText w:val="%1."/>
+      <w:lvlJc w:val="left"/>
+      <w:pPr>
+        <w:ind w:left="720" w:hanging="360"/>
+      </w:pPr>
+    </w:lvl>
+  </w:abstractNum>
+  <w:abstractNum w:abstractNumId="30" w15:restartNumberingAfterBreak="0">
+    <w:multiLevelType w:val="hybridMultilevel"/>
+    <w:lvl w:ilvl="0" w15:tentative="1">
+      <w:start w:val="1"/>
+      <w:numFmt w:val="lowerRoman"/>
+      <w:lvlText w:val="%1."/>
+      <w:lvlJc w:val="left"/>
+      <w:pPr>
+        <w:ind w:left="720" w:hanging="360"/>
+      </w:pPr>
+      <w:rPr>
+        <w:i/>
+        <w:iCs/>
+      </w:rPr>
     </w:lvl>
   </w:abstractNum>
   <w:num w:numId="1">
@@ -11309,6 +12984,30 @@
   </w:num>
   <w:num w:numId="26">
     <w:abstractNumId w:val="26"/>
+    <w:lvlOverride w:ilvl="0">
+      <w:startOverride w:val="1"/>
+    </w:lvlOverride>
+  </w:num>
+  <w:num w:numId="27">
+    <w:abstractNumId w:val="27"/>
+    <w:lvlOverride w:ilvl="0">
+      <w:startOverride w:val="1"/>
+    </w:lvlOverride>
+  </w:num>
+  <w:num w:numId="28">
+    <w:abstractNumId w:val="28"/>
+    <w:lvlOverride w:ilvl="0">
+      <w:startOverride w:val="1"/>
+    </w:lvlOverride>
+  </w:num>
+  <w:num w:numId="29">
+    <w:abstractNumId w:val="29"/>
+    <w:lvlOverride w:ilvl="0">
+      <w:startOverride w:val="1"/>
+    </w:lvlOverride>
+  </w:num>
+  <w:num w:numId="30">
+    <w:abstractNumId w:val="30"/>
     <w:lvlOverride w:ilvl="0">
       <w:startOverride w:val="1"/>
     </w:lvlOverride>

</xml_diff>

<commit_message>
Add Zimgeo training page link to Practical 1 and README
</commit_message>
<xml_diff>
--- a/practicals/Zimgeo_Intro_GIS_QGIS_Practical_1.docx
+++ b/practicals/Zimgeo_Intro_GIS_QGIS_Practical_1.docx
@@ -112,6 +112,20 @@
     </w:p>
     <w:p>
       <w:pPr>
+        <w:spacing w:after="20"/>
+        <w:jc w:val="center"/>
+      </w:pPr>
+      <w:r>
+        <w:rPr>
+          <w:rFonts w:ascii="Times New Roman" w:cs="Times New Roman" w:eastAsia="Times New Roman" w:hAnsi="Times New Roman"/>
+          <w:sz w:val="22"/>
+          <w:szCs w:val="22"/>
+        </w:rPr>
+        <w:t xml:space="preserve">info@zimgeo.co.zw  |  kudzai@zimgeo.co.zw  |  www.zimgeo.co.zw</w:t>
+      </w:r>
+    </w:p>
+    <w:p>
+      <w:pPr>
         <w:spacing w:after="240"/>
         <w:jc w:val="center"/>
       </w:pPr>
@@ -121,8 +135,19 @@
           <w:sz w:val="22"/>
           <w:szCs w:val="22"/>
         </w:rPr>
-        <w:t xml:space="preserve">info@zimgeo.co.zw  |  kudzai@zimgeo.co.zw  |  www.zimgeo.co.zw</w:t>
-      </w:r>
+        <w:t xml:space="preserve">Course materials: </w:t>
+      </w:r>
+      <w:hyperlink w:history="1" r:id="rIdnkjimevwzrqomt_erkehe">
+        <w:r>
+          <w:rPr>
+            <w:rStyle w:val="Hyperlink"/>
+            <w:rFonts w:ascii="Times New Roman" w:cs="Times New Roman" w:eastAsia="Times New Roman" w:hAnsi="Times New Roman"/>
+            <w:sz w:val="22"/>
+            <w:szCs w:val="22"/>
+          </w:rPr>
+          <w:t xml:space="preserve">https://www.zimgeo.co.zw/training-tutorials/</w:t>
+        </w:r>
+      </w:hyperlink>
     </w:p>
     <w:p>
       <w:pPr>
@@ -4107,7 +4132,7 @@
         </w:rPr>
         <w:t xml:space="preserve">All the data for this course is on the course page on GitHub: </w:t>
       </w:r>
-      <w:hyperlink w:history="1" r:id="rIdvv5iss1uo7qf1iqonlqln">
+      <w:hyperlink w:history="1" r:id="rId-kmwmnoqkc2jjus0gtkro">
         <w:r>
           <w:rPr>
             <w:rStyle w:val="Hyperlink"/>
@@ -4136,7 +4161,7 @@
         </w:rPr>
         <w:t xml:space="preserve"> (6.8 MB): </w:t>
       </w:r>
-      <w:hyperlink w:history="1" r:id="rIdct5fev0veeudlmlpddxpm">
+      <w:hyperlink w:history="1" r:id="rIdl9ytmf-h6vbznbkghipaz">
         <w:r>
           <w:rPr>
             <w:rStyle w:val="Hyperlink"/>
@@ -4164,6 +4189,33 @@
           <w:rFonts w:ascii="Times New Roman" w:cs="Times New Roman" w:eastAsia="Times New Roman" w:hAnsi="Times New Roman"/>
         </w:rPr>
         <w:t xml:space="preserve"> containing:</w:t>
+      </w:r>
+    </w:p>
+    <w:p>
+      <w:pPr>
+        <w:spacing w:after="120" w:line="276"/>
+        <w:jc w:val="left"/>
+      </w:pPr>
+      <w:r>
+        <w:rPr>
+          <w:rFonts w:ascii="Times New Roman" w:cs="Times New Roman" w:eastAsia="Times New Roman" w:hAnsi="Times New Roman"/>
+        </w:rPr>
+        <w:t xml:space="preserve">The practicals and data are also published on the Zimgeo training page: </w:t>
+      </w:r>
+      <w:hyperlink w:history="1" r:id="rId-vof9tsjh7hznwlibtjz3">
+        <w:r>
+          <w:rPr>
+            <w:rStyle w:val="Hyperlink"/>
+            <w:rFonts w:ascii="Times New Roman" w:cs="Times New Roman" w:eastAsia="Times New Roman" w:hAnsi="Times New Roman"/>
+          </w:rPr>
+          <w:t xml:space="preserve">https://www.zimgeo.co.zw/training-tutorials/</w:t>
+        </w:r>
+      </w:hyperlink>
+      <w:r>
+        <w:rPr>
+          <w:rFonts w:ascii="Times New Roman" w:cs="Times New Roman" w:eastAsia="Times New Roman" w:hAnsi="Times New Roman"/>
+        </w:rPr>
+        <w:t xml:space="preserve">.</w:t>
       </w:r>
     </w:p>
     <w:p>
@@ -10751,7 +10803,7 @@
         </w:rPr>
         <w:t xml:space="preserve">The plugin is on its own page on GitHub: </w:t>
       </w:r>
-      <w:hyperlink w:history="1" r:id="rIdxxr3qp5uhjm4twuqypzqb">
+      <w:hyperlink w:history="1" r:id="rIdbcwjnwv-oopv3q9toq7m6">
         <w:r>
           <w:rPr>
             <w:rStyle w:val="Hyperlink"/>
@@ -11012,7 +11064,7 @@
         </w:rPr>
         <w:t xml:space="preserve">Direct download link: </w:t>
       </w:r>
-      <w:hyperlink w:history="1" r:id="rIdwjvwy7g8fgoeoti-v5679">
+      <w:hyperlink w:history="1" r:id="rIdksmms8gbsstm7t2-l-zg-">
         <w:r>
           <w:rPr>
             <w:rStyle w:val="Hyperlink"/>
@@ -12170,15 +12222,30 @@
     <w:p>
       <w:pPr>
         <w:spacing w:after="120" w:line="276"/>
-        <w:jc w:val="both"/>
-      </w:pPr>
-      <w:r>
-        <w:rPr>
-          <w:rFonts w:ascii="Times New Roman" w:cs="Times New Roman" w:eastAsia="Times New Roman" w:hAnsi="Times New Roman"/>
-        </w:rPr>
-        <w:t xml:space="preserve">All course data and updates are on the course page: </w:t>
-      </w:r>
-      <w:hyperlink w:history="1" r:id="rId7uqhc-lvobgzxwyxc_fu4">
+        <w:jc w:val="left"/>
+      </w:pPr>
+      <w:r>
+        <w:rPr>
+          <w:rFonts w:ascii="Times New Roman" w:cs="Times New Roman" w:eastAsia="Times New Roman" w:hAnsi="Times New Roman"/>
+        </w:rPr>
+        <w:t xml:space="preserve">All course practicals, data and updates are on the Zimgeo training page, </w:t>
+      </w:r>
+      <w:hyperlink w:history="1" r:id="rIdb2daae2b3mrkcaa1tzhex">
+        <w:r>
+          <w:rPr>
+            <w:rStyle w:val="Hyperlink"/>
+            <w:rFonts w:ascii="Times New Roman" w:cs="Times New Roman" w:eastAsia="Times New Roman" w:hAnsi="Times New Roman"/>
+          </w:rPr>
+          <w:t xml:space="preserve">https://www.zimgeo.co.zw/training-tutorials/</w:t>
+        </w:r>
+      </w:hyperlink>
+      <w:r>
+        <w:rPr>
+          <w:rFonts w:ascii="Times New Roman" w:cs="Times New Roman" w:eastAsia="Times New Roman" w:hAnsi="Times New Roman"/>
+        </w:rPr>
+        <w:t xml:space="preserve">, and on the course page on GitHub, </w:t>
+      </w:r>
+      <w:hyperlink w:history="1" r:id="rIdwco0g4ozadwysiy1yfrmf">
         <w:r>
           <w:rPr>
             <w:rStyle w:val="Hyperlink"/>
@@ -12193,7 +12260,7 @@
         </w:rPr>
         <w:t xml:space="preserve">. For questions, contact the Zimgeo team at </w:t>
       </w:r>
-      <w:hyperlink w:history="1" r:id="rIdp4_etw9c5ilvsldw0sa4-">
+      <w:hyperlink w:history="1" r:id="rIdirzrcg7nz-a3racepy5ce">
         <w:r>
           <w:rPr>
             <w:rStyle w:val="Hyperlink"/>
@@ -12208,7 +12275,7 @@
         </w:rPr>
         <w:t xml:space="preserve"> or </w:t>
       </w:r>
-      <w:hyperlink w:history="1" r:id="rIdqgxxwda3siewtiwrjho9w">
+      <w:hyperlink w:history="1" r:id="rIdtennnub5gmirrwtw1fwxi">
         <w:r>
           <w:rPr>
             <w:rStyle w:val="Hyperlink"/>

</xml_diff>

<commit_message>
Note that later practicals are for enrolled students
</commit_message>
<xml_diff>
--- a/practicals/Zimgeo_Intro_GIS_QGIS_Practical_1.docx
+++ b/practicals/Zimgeo_Intro_GIS_QGIS_Practical_1.docx
@@ -137,7 +137,7 @@
         </w:rPr>
         <w:t xml:space="preserve">Course materials: </w:t>
       </w:r>
-      <w:hyperlink w:history="1" r:id="rIdnkjimevwzrqomt_erkehe">
+      <w:hyperlink w:history="1" r:id="rIdtr8dc4oslpvzgqby7jegf">
         <w:r>
           <w:rPr>
             <w:rStyle w:val="Hyperlink"/>
@@ -4132,7 +4132,7 @@
         </w:rPr>
         <w:t xml:space="preserve">All the data for this course is on the course page on GitHub: </w:t>
       </w:r>
-      <w:hyperlink w:history="1" r:id="rId-kmwmnoqkc2jjus0gtkro">
+      <w:hyperlink w:history="1" r:id="rId7cnlawjlf38rddlzhvde8">
         <w:r>
           <w:rPr>
             <w:rStyle w:val="Hyperlink"/>
@@ -4161,7 +4161,7 @@
         </w:rPr>
         <w:t xml:space="preserve"> (6.8 MB): </w:t>
       </w:r>
-      <w:hyperlink w:history="1" r:id="rIdl9ytmf-h6vbznbkghipaz">
+      <w:hyperlink w:history="1" r:id="rId6rx8lgzgc6cgxqb6liz-n">
         <w:r>
           <w:rPr>
             <w:rStyle w:val="Hyperlink"/>
@@ -4202,7 +4202,7 @@
         </w:rPr>
         <w:t xml:space="preserve">The practicals and data are also published on the Zimgeo training page: </w:t>
       </w:r>
-      <w:hyperlink w:history="1" r:id="rId-vof9tsjh7hznwlibtjz3">
+      <w:hyperlink w:history="1" r:id="rIdf_q1ny0vymkfn-w8dzgsd">
         <w:r>
           <w:rPr>
             <w:rStyle w:val="Hyperlink"/>
@@ -10803,7 +10803,7 @@
         </w:rPr>
         <w:t xml:space="preserve">The plugin is on its own page on GitHub: </w:t>
       </w:r>
-      <w:hyperlink w:history="1" r:id="rIdbcwjnwv-oopv3q9toq7m6">
+      <w:hyperlink w:history="1" r:id="rId7dcknvvtk0acgrmjb0quz">
         <w:r>
           <w:rPr>
             <w:rStyle w:val="Hyperlink"/>
@@ -11064,7 +11064,7 @@
         </w:rPr>
         <w:t xml:space="preserve">Direct download link: </w:t>
       </w:r>
-      <w:hyperlink w:history="1" r:id="rIdksmms8gbsstm7t2-l-zg-">
+      <w:hyperlink w:history="1" r:id="rIdywrshezqdvhnqjtfbcv7g">
         <w:r>
           <w:rPr>
             <w:rStyle w:val="Hyperlink"/>
@@ -12187,16 +12187,22 @@
       <w:r>
         <w:rPr>
           <w:rFonts w:ascii="Times New Roman" w:cs="Times New Roman" w:eastAsia="Times New Roman" w:hAnsi="Times New Roman"/>
-          <w:b/>
-          <w:bCs/>
-        </w:rPr>
-        <w:t xml:space="preserve">Session 2: Raster data.</w:t>
-      </w:r>
-      <w:r>
-        <w:rPr>
-          <w:rFonts w:ascii="Times New Roman" w:cs="Times New Roman" w:eastAsia="Times New Roman" w:hAnsi="Times New Roman"/>
-        </w:rPr>
-        <w:t xml:space="preserve"> You will work with satellite images and elevation data, learn about cell size and bands, and style and analyse raster layers in QGIS.</w:t>
+        </w:rPr>
+        <w:t xml:space="preserve">Practical 1 is free and open to everyone. </w:t>
+      </w:r>
+      <w:r>
+        <w:rPr>
+          <w:rFonts w:ascii="Times New Roman" w:cs="Times New Roman" w:eastAsia="Times New Roman" w:hAnsi="Times New Roman"/>
+          <w:b/>
+          <w:bCs/>
+        </w:rPr>
+        <w:t xml:space="preserve">The remaining practicals, with their data, will be available to students enrolled on the course.</w:t>
+      </w:r>
+      <w:r>
+        <w:rPr>
+          <w:rFonts w:ascii="Times New Roman" w:cs="Times New Roman" w:eastAsia="Times New Roman" w:hAnsi="Times New Roman"/>
+        </w:rPr>
+        <w:t xml:space="preserve"> To enrol, contact the Zimgeo team (details below) or visit the Zimgeo training page.</w:t>
       </w:r>
     </w:p>
     <w:p>
@@ -12210,6 +12216,26 @@
           <w:b/>
           <w:bCs/>
         </w:rPr>
+        <w:t xml:space="preserve">Session 2: Raster data.</w:t>
+      </w:r>
+      <w:r>
+        <w:rPr>
+          <w:rFonts w:ascii="Times New Roman" w:cs="Times New Roman" w:eastAsia="Times New Roman" w:hAnsi="Times New Roman"/>
+        </w:rPr>
+        <w:t xml:space="preserve"> You will work with satellite images and elevation data, learn about cell size and bands, and style and analyse raster layers in QGIS.</w:t>
+      </w:r>
+    </w:p>
+    <w:p>
+      <w:pPr>
+        <w:spacing w:after="120" w:line="276"/>
+        <w:jc w:val="both"/>
+      </w:pPr>
+      <w:r>
+        <w:rPr>
+          <w:rFonts w:ascii="Times New Roman" w:cs="Times New Roman" w:eastAsia="Times New Roman" w:hAnsi="Times New Roman"/>
+          <w:b/>
+          <w:bCs/>
+        </w:rPr>
         <w:t xml:space="preserve">Session 3: Georeferencing.</w:t>
       </w:r>
       <w:r>
@@ -12230,7 +12256,7 @@
         </w:rPr>
         <w:t xml:space="preserve">All course practicals, data and updates are on the Zimgeo training page, </w:t>
       </w:r>
-      <w:hyperlink w:history="1" r:id="rIdb2daae2b3mrkcaa1tzhex">
+      <w:hyperlink w:history="1" r:id="rIdhe8mgsksm_whbt8jhhisn">
         <w:r>
           <w:rPr>
             <w:rStyle w:val="Hyperlink"/>
@@ -12245,7 +12271,7 @@
         </w:rPr>
         <w:t xml:space="preserve">, and on the course page on GitHub, </w:t>
       </w:r>
-      <w:hyperlink w:history="1" r:id="rIdwco0g4ozadwysiy1yfrmf">
+      <w:hyperlink w:history="1" r:id="rIdd1ebhctwo3b4ld_tqjfqy">
         <w:r>
           <w:rPr>
             <w:rStyle w:val="Hyperlink"/>
@@ -12260,7 +12286,7 @@
         </w:rPr>
         <w:t xml:space="preserve">. For questions, contact the Zimgeo team at </w:t>
       </w:r>
-      <w:hyperlink w:history="1" r:id="rIdirzrcg7nz-a3racepy5ce">
+      <w:hyperlink w:history="1" r:id="rIdsdgfqsjevnn_6vgd3_ujn">
         <w:r>
           <w:rPr>
             <w:rStyle w:val="Hyperlink"/>
@@ -12275,7 +12301,7 @@
         </w:rPr>
         <w:t xml:space="preserve"> or </w:t>
       </w:r>
-      <w:hyperlink w:history="1" r:id="rIdtennnub5gmirrwtw1fwxi">
+      <w:hyperlink w:history="1" r:id="rIdlbsqdz88clynre2tmyac2">
         <w:r>
           <w:rPr>
             <w:rStyle w:val="Hyperlink"/>

</xml_diff>

<commit_message>
Practical 1: clarify closing note on course materials
</commit_message>
<xml_diff>
--- a/practicals/Zimgeo_Intro_GIS_QGIS_Practical_1.docx
+++ b/practicals/Zimgeo_Intro_GIS_QGIS_Practical_1.docx
@@ -137,7 +137,7 @@
         </w:rPr>
         <w:t xml:space="preserve">Course materials: </w:t>
       </w:r>
-      <w:hyperlink w:history="1" r:id="rIdtr8dc4oslpvzgqby7jegf">
+      <w:hyperlink w:history="1" r:id="rIdset8ai1kw9eu5nwe14dmq">
         <w:r>
           <w:rPr>
             <w:rStyle w:val="Hyperlink"/>
@@ -4132,7 +4132,7 @@
         </w:rPr>
         <w:t xml:space="preserve">All the data for this course is on the course page on GitHub: </w:t>
       </w:r>
-      <w:hyperlink w:history="1" r:id="rId7cnlawjlf38rddlzhvde8">
+      <w:hyperlink w:history="1" r:id="rIdg-qtvcmhqeumnnd_hvnfl">
         <w:r>
           <w:rPr>
             <w:rStyle w:val="Hyperlink"/>
@@ -4161,7 +4161,7 @@
         </w:rPr>
         <w:t xml:space="preserve"> (6.8 MB): </w:t>
       </w:r>
-      <w:hyperlink w:history="1" r:id="rId6rx8lgzgc6cgxqb6liz-n">
+      <w:hyperlink w:history="1" r:id="rIddr-2gnywex7kha1pfpq1h">
         <w:r>
           <w:rPr>
             <w:rStyle w:val="Hyperlink"/>
@@ -4202,7 +4202,7 @@
         </w:rPr>
         <w:t xml:space="preserve">The practicals and data are also published on the Zimgeo training page: </w:t>
       </w:r>
-      <w:hyperlink w:history="1" r:id="rIdf_q1ny0vymkfn-w8dzgsd">
+      <w:hyperlink w:history="1" r:id="rId7pbcozmr11srf27o6auql">
         <w:r>
           <w:rPr>
             <w:rStyle w:val="Hyperlink"/>
@@ -10803,7 +10803,7 @@
         </w:rPr>
         <w:t xml:space="preserve">The plugin is on its own page on GitHub: </w:t>
       </w:r>
-      <w:hyperlink w:history="1" r:id="rId7dcknvvtk0acgrmjb0quz">
+      <w:hyperlink w:history="1" r:id="rId59aifzouwyed-7-_tlkbf">
         <w:r>
           <w:rPr>
             <w:rStyle w:val="Hyperlink"/>
@@ -11064,7 +11064,7 @@
         </w:rPr>
         <w:t xml:space="preserve">Direct download link: </w:t>
       </w:r>
-      <w:hyperlink w:history="1" r:id="rIdywrshezqdvhnqjtfbcv7g">
+      <w:hyperlink w:history="1" r:id="rIdd33mdmwcs67haxi3klkza">
         <w:r>
           <w:rPr>
             <w:rStyle w:val="Hyperlink"/>
@@ -12254,9 +12254,9 @@
         <w:rPr>
           <w:rFonts w:ascii="Times New Roman" w:cs="Times New Roman" w:eastAsia="Times New Roman" w:hAnsi="Times New Roman"/>
         </w:rPr>
-        <w:t xml:space="preserve">All course practicals, data and updates are on the Zimgeo training page, </w:t>
-      </w:r>
-      <w:hyperlink w:history="1" r:id="rIdhe8mgsksm_whbt8jhhisn">
+        <w:t xml:space="preserve">Course information, updates and the Practical 1 data are on the Zimgeo training page, </w:t>
+      </w:r>
+      <w:hyperlink w:history="1" r:id="rId_9s4bwa1is-xotn9mvcap">
         <w:r>
           <w:rPr>
             <w:rStyle w:val="Hyperlink"/>
@@ -12271,7 +12271,7 @@
         </w:rPr>
         <w:t xml:space="preserve">, and on the course page on GitHub, </w:t>
       </w:r>
-      <w:hyperlink w:history="1" r:id="rIdd1ebhctwo3b4ld_tqjfqy">
+      <w:hyperlink w:history="1" r:id="rId2sj-20swh-5xxzxspsjnv">
         <w:r>
           <w:rPr>
             <w:rStyle w:val="Hyperlink"/>
@@ -12286,7 +12286,7 @@
         </w:rPr>
         <w:t xml:space="preserve">. For questions, contact the Zimgeo team at </w:t>
       </w:r>
-      <w:hyperlink w:history="1" r:id="rIdsdgfqsjevnn_6vgd3_ujn">
+      <w:hyperlink w:history="1" r:id="rIdv989hsxhs-p-bi_dwyxwg">
         <w:r>
           <w:rPr>
             <w:rStyle w:val="Hyperlink"/>
@@ -12301,7 +12301,7 @@
         </w:rPr>
         <w:t xml:space="preserve"> or </w:t>
       </w:r>
-      <w:hyperlink w:history="1" r:id="rIdlbsqdz88clynre2tmyac2">
+      <w:hyperlink w:history="1" r:id="rIdcflh0m3cmeubzzkidke2t">
         <w:r>
           <w:rPr>
             <w:rStyle w:val="Hyperlink"/>

</xml_diff>

<commit_message>
Practical 1: refresh screenshots
</commit_message>
<xml_diff>
--- a/practicals/Zimgeo_Intro_GIS_QGIS_Practical_1.docx
+++ b/practicals/Zimgeo_Intro_GIS_QGIS_Practical_1.docx
@@ -137,7 +137,7 @@
         </w:rPr>
         <w:t xml:space="preserve">Course materials: </w:t>
       </w:r>
-      <w:hyperlink w:history="1" r:id="rIdset8ai1kw9eu5nwe14dmq">
+      <w:hyperlink w:history="1" r:id="rIdiewql3iqxtrik6pfpp4iw">
         <w:r>
           <w:rPr>
             <w:rStyle w:val="Hyperlink"/>
@@ -4132,7 +4132,7 @@
         </w:rPr>
         <w:t xml:space="preserve">All the data for this course is on the course page on GitHub: </w:t>
       </w:r>
-      <w:hyperlink w:history="1" r:id="rIdg-qtvcmhqeumnnd_hvnfl">
+      <w:hyperlink w:history="1" r:id="rIdxxn3pgmityfksmxlmt0j5">
         <w:r>
           <w:rPr>
             <w:rStyle w:val="Hyperlink"/>
@@ -4161,7 +4161,7 @@
         </w:rPr>
         <w:t xml:space="preserve"> (6.8 MB): </w:t>
       </w:r>
-      <w:hyperlink w:history="1" r:id="rIddr-2gnywex7kha1pfpq1h">
+      <w:hyperlink w:history="1" r:id="rId0covogm4zqur_hnl5ji9h">
         <w:r>
           <w:rPr>
             <w:rStyle w:val="Hyperlink"/>
@@ -4202,7 +4202,7 @@
         </w:rPr>
         <w:t xml:space="preserve">The practicals and data are also published on the Zimgeo training page: </w:t>
       </w:r>
-      <w:hyperlink w:history="1" r:id="rId7pbcozmr11srf27o6auql">
+      <w:hyperlink w:history="1" r:id="rId4skqrz6ulygs6zirp6z8v">
         <w:r>
           <w:rPr>
             <w:rStyle w:val="Hyperlink"/>
@@ -10803,7 +10803,7 @@
         </w:rPr>
         <w:t xml:space="preserve">The plugin is on its own page on GitHub: </w:t>
       </w:r>
-      <w:hyperlink w:history="1" r:id="rId59aifzouwyed-7-_tlkbf">
+      <w:hyperlink w:history="1" r:id="rIdeu4rs6vo4viddbopf-wrn">
         <w:r>
           <w:rPr>
             <w:rStyle w:val="Hyperlink"/>
@@ -11064,7 +11064,7 @@
         </w:rPr>
         <w:t xml:space="preserve">Direct download link: </w:t>
       </w:r>
-      <w:hyperlink w:history="1" r:id="rIdd33mdmwcs67haxi3klkza">
+      <w:hyperlink w:history="1" r:id="rIdyi3mix5yhjcx1flciv_sl">
         <w:r>
           <w:rPr>
             <w:rStyle w:val="Hyperlink"/>
@@ -12256,7 +12256,7 @@
         </w:rPr>
         <w:t xml:space="preserve">Course information, updates and the Practical 1 data are on the Zimgeo training page, </w:t>
       </w:r>
-      <w:hyperlink w:history="1" r:id="rId_9s4bwa1is-xotn9mvcap">
+      <w:hyperlink w:history="1" r:id="rIdrnjpmlx_yljg2frxjy7tm">
         <w:r>
           <w:rPr>
             <w:rStyle w:val="Hyperlink"/>
@@ -12271,7 +12271,7 @@
         </w:rPr>
         <w:t xml:space="preserve">, and on the course page on GitHub, </w:t>
       </w:r>
-      <w:hyperlink w:history="1" r:id="rId2sj-20swh-5xxzxspsjnv">
+      <w:hyperlink w:history="1" r:id="rIdbsxl_gs4rhnidf3a2mpt_">
         <w:r>
           <w:rPr>
             <w:rStyle w:val="Hyperlink"/>
@@ -12286,7 +12286,7 @@
         </w:rPr>
         <w:t xml:space="preserve">. For questions, contact the Zimgeo team at </w:t>
       </w:r>
-      <w:hyperlink w:history="1" r:id="rIdv989hsxhs-p-bi_dwyxwg">
+      <w:hyperlink w:history="1" r:id="rId4a0udkzwye4-hcxrwgj4-">
         <w:r>
           <w:rPr>
             <w:rStyle w:val="Hyperlink"/>
@@ -12301,7 +12301,7 @@
         </w:rPr>
         <w:t xml:space="preserve"> or </w:t>
       </w:r>
-      <w:hyperlink w:history="1" r:id="rIdcflh0m3cmeubzzkidke2t">
+      <w:hyperlink w:history="1" r:id="rIdk1ys-piqcikgnwcmmalmy">
         <w:r>
           <w:rPr>
             <w:rStyle w:val="Hyperlink"/>

</xml_diff>

<commit_message>
Add course plan: coordinate systems, data collection and advanced sessions
</commit_message>
<xml_diff>
--- a/practicals/Zimgeo_Intro_GIS_QGIS_Practical_1.docx
+++ b/practicals/Zimgeo_Intro_GIS_QGIS_Practical_1.docx
@@ -137,7 +137,7 @@
         </w:rPr>
         <w:t xml:space="preserve">Course materials: </w:t>
       </w:r>
-      <w:hyperlink w:history="1" r:id="rIdiewql3iqxtrik6pfpp4iw">
+      <w:hyperlink w:history="1" r:id="rIdmg8qmcr5h8e6te8b2xxed">
         <w:r>
           <w:rPr>
             <w:rStyle w:val="Hyperlink"/>
@@ -228,7 +228,21 @@
         <w:rPr>
           <w:rFonts w:ascii="Times New Roman" w:cs="Times New Roman" w:eastAsia="Times New Roman" w:hAnsi="Times New Roman"/>
         </w:rPr>
-        <w:t xml:space="preserve">: points, lines and polygons. The next session covers </w:t>
+        <w:t xml:space="preserve">: points, lines and polygons. Later sessions build on it: </w:t>
+      </w:r>
+      <w:r>
+        <w:rPr>
+          <w:rFonts w:ascii="Times New Roman" w:cs="Times New Roman" w:eastAsia="Times New Roman" w:hAnsi="Times New Roman"/>
+          <w:b/>
+          <w:bCs/>
+        </w:rPr>
+        <w:t xml:space="preserve">Session 2</w:t>
+      </w:r>
+      <w:r>
+        <w:rPr>
+          <w:rFonts w:ascii="Times New Roman" w:cs="Times New Roman" w:eastAsia="Times New Roman" w:hAnsi="Times New Roman"/>
+        </w:rPr>
+        <w:t xml:space="preserve"> covers </w:t>
       </w:r>
       <w:r>
         <w:rPr>
@@ -242,7 +256,21 @@
         <w:rPr>
           <w:rFonts w:ascii="Times New Roman" w:cs="Times New Roman" w:eastAsia="Times New Roman" w:hAnsi="Times New Roman"/>
         </w:rPr>
-        <w:t xml:space="preserve">, and the session after that covers </w:t>
+        <w:t xml:space="preserve">, </w:t>
+      </w:r>
+      <w:r>
+        <w:rPr>
+          <w:rFonts w:ascii="Times New Roman" w:cs="Times New Roman" w:eastAsia="Times New Roman" w:hAnsi="Times New Roman"/>
+          <w:b/>
+          <w:bCs/>
+        </w:rPr>
+        <w:t xml:space="preserve">Session 3</w:t>
+      </w:r>
+      <w:r>
+        <w:rPr>
+          <w:rFonts w:ascii="Times New Roman" w:cs="Times New Roman" w:eastAsia="Times New Roman" w:hAnsi="Times New Roman"/>
+        </w:rPr>
+        <w:t xml:space="preserve"> </w:t>
       </w:r>
       <w:r>
         <w:rPr>
@@ -256,7 +284,77 @@
         <w:rPr>
           <w:rFonts w:ascii="Times New Roman" w:cs="Times New Roman" w:eastAsia="Times New Roman" w:hAnsi="Times New Roman"/>
         </w:rPr>
-        <w:t xml:space="preserve">. Both are introduced briefly here so that you can see how the three topics fit together.</w:t>
+        <w:t xml:space="preserve">, </w:t>
+      </w:r>
+      <w:r>
+        <w:rPr>
+          <w:rFonts w:ascii="Times New Roman" w:cs="Times New Roman" w:eastAsia="Times New Roman" w:hAnsi="Times New Roman"/>
+          <w:b/>
+          <w:bCs/>
+        </w:rPr>
+        <w:t xml:space="preserve">Session 4</w:t>
+      </w:r>
+      <w:r>
+        <w:rPr>
+          <w:rFonts w:ascii="Times New Roman" w:cs="Times New Roman" w:eastAsia="Times New Roman" w:hAnsi="Times New Roman"/>
+        </w:rPr>
+        <w:t xml:space="preserve"> </w:t>
+      </w:r>
+      <w:r>
+        <w:rPr>
+          <w:rFonts w:ascii="Times New Roman" w:cs="Times New Roman" w:eastAsia="Times New Roman" w:hAnsi="Times New Roman"/>
+          <w:b/>
+          <w:bCs/>
+        </w:rPr>
+        <w:t xml:space="preserve">coordinate systems</w:t>
+      </w:r>
+      <w:r>
+        <w:rPr>
+          <w:rFonts w:ascii="Times New Roman" w:cs="Times New Roman" w:eastAsia="Times New Roman" w:hAnsi="Times New Roman"/>
+        </w:rPr>
+        <w:t xml:space="preserve"> and </w:t>
+      </w:r>
+      <w:r>
+        <w:rPr>
+          <w:rFonts w:ascii="Times New Roman" w:cs="Times New Roman" w:eastAsia="Times New Roman" w:hAnsi="Times New Roman"/>
+          <w:b/>
+          <w:bCs/>
+        </w:rPr>
+        <w:t xml:space="preserve">Session 5</w:t>
+      </w:r>
+      <w:r>
+        <w:rPr>
+          <w:rFonts w:ascii="Times New Roman" w:cs="Times New Roman" w:eastAsia="Times New Roman" w:hAnsi="Times New Roman"/>
+        </w:rPr>
+        <w:t xml:space="preserve"> </w:t>
+      </w:r>
+      <w:r>
+        <w:rPr>
+          <w:rFonts w:ascii="Times New Roman" w:cs="Times New Roman" w:eastAsia="Times New Roman" w:hAnsi="Times New Roman"/>
+          <w:b/>
+          <w:bCs/>
+        </w:rPr>
+        <w:t xml:space="preserve">data collection</w:t>
+      </w:r>
+      <w:r>
+        <w:rPr>
+          <w:rFonts w:ascii="Times New Roman" w:cs="Times New Roman" w:eastAsia="Times New Roman" w:hAnsi="Times New Roman"/>
+        </w:rPr>
+        <w:t xml:space="preserve">, followed by sessions on </w:t>
+      </w:r>
+      <w:r>
+        <w:rPr>
+          <w:rFonts w:ascii="Times New Roman" w:cs="Times New Roman" w:eastAsia="Times New Roman" w:hAnsi="Times New Roman"/>
+          <w:b/>
+          <w:bCs/>
+        </w:rPr>
+        <w:t xml:space="preserve">advanced data processing in QGIS</w:t>
+      </w:r>
+      <w:r>
+        <w:rPr>
+          <w:rFonts w:ascii="Times New Roman" w:cs="Times New Roman" w:eastAsia="Times New Roman" w:hAnsi="Times New Roman"/>
+        </w:rPr>
+        <w:t xml:space="preserve">. Raster data, coordinate systems and georeferencing are introduced briefly here so that you can see how the topics fit together.</w:t>
       </w:r>
     </w:p>
     <w:p>
@@ -3698,7 +3796,21 @@
         <w:rPr>
           <w:rFonts w:ascii="Times New Roman" w:cs="Times New Roman" w:eastAsia="Times New Roman" w:hAnsi="Times New Roman"/>
         </w:rPr>
-        <w:t xml:space="preserve"> CRS flattens the Earth onto a plane so that positions can be given in metres. Because one degree of longitude is about 105 km in Zimbabwe but one degree of latitude is about 111 km, areas and distances calculated directly in degrees are meaningless. You will check the CRS of the practical data in Task 5.</w:t>
+        <w:t xml:space="preserve"> CRS flattens the Earth onto a plane so that positions can be given in metres. Because one degree of longitude is about 105 km in Zimbabwe but one degree of latitude is about 111 km, areas and distances calculated directly in degrees are meaningless. You will check the CRS of the practical data in Task 5. </w:t>
+      </w:r>
+      <w:r>
+        <w:rPr>
+          <w:rFonts w:ascii="Times New Roman" w:cs="Times New Roman" w:eastAsia="Times New Roman" w:hAnsi="Times New Roman"/>
+          <w:b/>
+          <w:bCs/>
+        </w:rPr>
+        <w:t xml:space="preserve">Session 4 covers coordinate systems in depth</w:t>
+      </w:r>
+      <w:r>
+        <w:rPr>
+          <w:rFonts w:ascii="Times New Roman" w:cs="Times New Roman" w:eastAsia="Times New Roman" w:hAnsi="Times New Roman"/>
+        </w:rPr>
+        <w:t xml:space="preserve">, including UTM zones, datums and reprojecting data from one CRS to another.</w:t>
       </w:r>
     </w:p>
     <w:p>
@@ -4132,7 +4244,7 @@
         </w:rPr>
         <w:t xml:space="preserve">All the data for this course is on the course page on GitHub: </w:t>
       </w:r>
-      <w:hyperlink w:history="1" r:id="rIdxxn3pgmityfksmxlmt0j5">
+      <w:hyperlink w:history="1" r:id="rId0xjxp3xbu49mn32q1fxrn">
         <w:r>
           <w:rPr>
             <w:rStyle w:val="Hyperlink"/>
@@ -4161,7 +4273,7 @@
         </w:rPr>
         <w:t xml:space="preserve"> (6.8 MB): </w:t>
       </w:r>
-      <w:hyperlink w:history="1" r:id="rId0covogm4zqur_hnl5ji9h">
+      <w:hyperlink w:history="1" r:id="rIdy1fmmrx391ratvlfaliwn">
         <w:r>
           <w:rPr>
             <w:rStyle w:val="Hyperlink"/>
@@ -4202,7 +4314,7 @@
         </w:rPr>
         <w:t xml:space="preserve">The practicals and data are also published on the Zimgeo training page: </w:t>
       </w:r>
-      <w:hyperlink w:history="1" r:id="rId4skqrz6ulygs6zirp6z8v">
+      <w:hyperlink w:history="1" r:id="rId142kd71onenckpr2tpowd">
         <w:r>
           <w:rPr>
             <w:rStyle w:val="Hyperlink"/>
@@ -10803,7 +10915,7 @@
         </w:rPr>
         <w:t xml:space="preserve">The plugin is on its own page on GitHub: </w:t>
       </w:r>
-      <w:hyperlink w:history="1" r:id="rIdeu4rs6vo4viddbopf-wrn">
+      <w:hyperlink w:history="1" r:id="rIdyhrxbm4jvzf6fv6zqcgs8">
         <w:r>
           <w:rPr>
             <w:rStyle w:val="Hyperlink"/>
@@ -11064,7 +11176,7 @@
         </w:rPr>
         <w:t xml:space="preserve">Direct download link: </w:t>
       </w:r>
-      <w:hyperlink w:history="1" r:id="rIdyi3mix5yhjcx1flciv_sl">
+      <w:hyperlink w:history="1" r:id="rIdncaf6erofckbdch6-wyvs">
         <w:r>
           <w:rPr>
             <w:rStyle w:val="Hyperlink"/>
@@ -12248,6 +12360,66 @@
     <w:p>
       <w:pPr>
         <w:spacing w:after="120" w:line="276"/>
+        <w:jc w:val="both"/>
+      </w:pPr>
+      <w:r>
+        <w:rPr>
+          <w:rFonts w:ascii="Times New Roman" w:cs="Times New Roman" w:eastAsia="Times New Roman" w:hAnsi="Times New Roman"/>
+          <w:b/>
+          <w:bCs/>
+        </w:rPr>
+        <w:t xml:space="preserve">Session 4: Coordinate systems.</w:t>
+      </w:r>
+      <w:r>
+        <w:rPr>
+          <w:rFonts w:ascii="Times New Roman" w:cs="Times New Roman" w:eastAsia="Times New Roman" w:hAnsi="Times New Roman"/>
+        </w:rPr>
+        <w:t xml:space="preserve"> You will look more closely at geographic and projected coordinate systems, UTM zones 35S and 36S, datums, and how to reproject layers so that distances and areas are correct.</w:t>
+      </w:r>
+    </w:p>
+    <w:p>
+      <w:pPr>
+        <w:spacing w:after="120" w:line="276"/>
+        <w:jc w:val="both"/>
+      </w:pPr>
+      <w:r>
+        <w:rPr>
+          <w:rFonts w:ascii="Times New Roman" w:cs="Times New Roman" w:eastAsia="Times New Roman" w:hAnsi="Times New Roman"/>
+          <w:b/>
+          <w:bCs/>
+        </w:rPr>
+        <w:t xml:space="preserve">Session 5: Data collection.</w:t>
+      </w:r>
+      <w:r>
+        <w:rPr>
+          <w:rFonts w:ascii="Times New Roman" w:cs="Times New Roman" w:eastAsia="Times New Roman" w:hAnsi="Times New Roman"/>
+        </w:rPr>
+        <w:t xml:space="preserve"> You will collect your own data in the field with GPS and a mobile data collection app, and bring it into QGIS.</w:t>
+      </w:r>
+    </w:p>
+    <w:p>
+      <w:pPr>
+        <w:spacing w:after="120" w:line="276"/>
+        <w:jc w:val="both"/>
+      </w:pPr>
+      <w:r>
+        <w:rPr>
+          <w:rFonts w:ascii="Times New Roman" w:cs="Times New Roman" w:eastAsia="Times New Roman" w:hAnsi="Times New Roman"/>
+          <w:b/>
+          <w:bCs/>
+        </w:rPr>
+        <w:t xml:space="preserve">Sessions 6 onwards: Advanced data processing in QGIS.</w:t>
+      </w:r>
+      <w:r>
+        <w:rPr>
+          <w:rFonts w:ascii="Times New Roman" w:cs="Times New Roman" w:eastAsia="Times New Roman" w:hAnsi="Times New Roman"/>
+        </w:rPr>
+        <w:t xml:space="preserve"> Geoprocessing and spatial analysis tools, joins and summaries, raster analysis and automating your work.</w:t>
+      </w:r>
+    </w:p>
+    <w:p>
+      <w:pPr>
+        <w:spacing w:after="120" w:line="276"/>
         <w:jc w:val="left"/>
       </w:pPr>
       <w:r>
@@ -12256,7 +12428,7 @@
         </w:rPr>
         <w:t xml:space="preserve">Course information, updates and the Practical 1 data are on the Zimgeo training page, </w:t>
       </w:r>
-      <w:hyperlink w:history="1" r:id="rIdrnjpmlx_yljg2frxjy7tm">
+      <w:hyperlink w:history="1" r:id="rIdpvbkp0hjpinsaz3_euca0">
         <w:r>
           <w:rPr>
             <w:rStyle w:val="Hyperlink"/>
@@ -12271,7 +12443,7 @@
         </w:rPr>
         <w:t xml:space="preserve">, and on the course page on GitHub, </w:t>
       </w:r>
-      <w:hyperlink w:history="1" r:id="rIdbsxl_gs4rhnidf3a2mpt_">
+      <w:hyperlink w:history="1" r:id="rIdgmecasffk4zp5a0zrcwqk">
         <w:r>
           <w:rPr>
             <w:rStyle w:val="Hyperlink"/>
@@ -12286,7 +12458,7 @@
         </w:rPr>
         <w:t xml:space="preserve">. For questions, contact the Zimgeo team at </w:t>
       </w:r>
-      <w:hyperlink w:history="1" r:id="rId4a0udkzwye4-hcxrwgj4-">
+      <w:hyperlink w:history="1" r:id="rIdwadpahuvynzywb2msaj2u">
         <w:r>
           <w:rPr>
             <w:rStyle w:val="Hyperlink"/>
@@ -12301,7 +12473,7 @@
         </w:rPr>
         <w:t xml:space="preserve"> or </w:t>
       </w:r>
-      <w:hyperlink w:history="1" r:id="rIdk1ys-piqcikgnwcmmalmy">
+      <w:hyperlink w:history="1" r:id="rIdmnypsc7ytbmpw--usgx9d">
         <w:r>
           <w:rPr>
             <w:rStyle w:val="Hyperlink"/>

</xml_diff>

<commit_message>
Course plan: coordinate systems before georeferencing
</commit_message>
<xml_diff>
--- a/practicals/Zimgeo_Intro_GIS_QGIS_Practical_1.docx
+++ b/practicals/Zimgeo_Intro_GIS_QGIS_Practical_1.docx
@@ -137,7 +137,7 @@
         </w:rPr>
         <w:t xml:space="preserve">Course materials: </w:t>
       </w:r>
-      <w:hyperlink w:history="1" r:id="rIdmg8qmcr5h8e6te8b2xxed">
+      <w:hyperlink w:history="1" r:id="rIdatcebghea1ycyyqhulz83">
         <w:r>
           <w:rPr>
             <w:rStyle w:val="Hyperlink"/>
@@ -278,35 +278,35 @@
           <w:b/>
           <w:bCs/>
         </w:rPr>
+        <w:t xml:space="preserve">coordinate systems</w:t>
+      </w:r>
+      <w:r>
+        <w:rPr>
+          <w:rFonts w:ascii="Times New Roman" w:cs="Times New Roman" w:eastAsia="Times New Roman" w:hAnsi="Times New Roman"/>
+        </w:rPr>
+        <w:t xml:space="preserve">, </w:t>
+      </w:r>
+      <w:r>
+        <w:rPr>
+          <w:rFonts w:ascii="Times New Roman" w:cs="Times New Roman" w:eastAsia="Times New Roman" w:hAnsi="Times New Roman"/>
+          <w:b/>
+          <w:bCs/>
+        </w:rPr>
+        <w:t xml:space="preserve">Session 4</w:t>
+      </w:r>
+      <w:r>
+        <w:rPr>
+          <w:rFonts w:ascii="Times New Roman" w:cs="Times New Roman" w:eastAsia="Times New Roman" w:hAnsi="Times New Roman"/>
+        </w:rPr>
+        <w:t xml:space="preserve"> </w:t>
+      </w:r>
+      <w:r>
+        <w:rPr>
+          <w:rFonts w:ascii="Times New Roman" w:cs="Times New Roman" w:eastAsia="Times New Roman" w:hAnsi="Times New Roman"/>
+          <w:b/>
+          <w:bCs/>
+        </w:rPr>
         <w:t xml:space="preserve">georeferencing</w:t>
-      </w:r>
-      <w:r>
-        <w:rPr>
-          <w:rFonts w:ascii="Times New Roman" w:cs="Times New Roman" w:eastAsia="Times New Roman" w:hAnsi="Times New Roman"/>
-        </w:rPr>
-        <w:t xml:space="preserve">, </w:t>
-      </w:r>
-      <w:r>
-        <w:rPr>
-          <w:rFonts w:ascii="Times New Roman" w:cs="Times New Roman" w:eastAsia="Times New Roman" w:hAnsi="Times New Roman"/>
-          <w:b/>
-          <w:bCs/>
-        </w:rPr>
-        <w:t xml:space="preserve">Session 4</w:t>
-      </w:r>
-      <w:r>
-        <w:rPr>
-          <w:rFonts w:ascii="Times New Roman" w:cs="Times New Roman" w:eastAsia="Times New Roman" w:hAnsi="Times New Roman"/>
-        </w:rPr>
-        <w:t xml:space="preserve"> </w:t>
-      </w:r>
-      <w:r>
-        <w:rPr>
-          <w:rFonts w:ascii="Times New Roman" w:cs="Times New Roman" w:eastAsia="Times New Roman" w:hAnsi="Times New Roman"/>
-          <w:b/>
-          <w:bCs/>
-        </w:rPr>
-        <w:t xml:space="preserve">coordinate systems</w:t>
       </w:r>
       <w:r>
         <w:rPr>
@@ -3804,7 +3804,7 @@
           <w:b/>
           <w:bCs/>
         </w:rPr>
-        <w:t xml:space="preserve">Session 4 covers coordinate systems in depth</w:t>
+        <w:t xml:space="preserve">Session 3 covers coordinate systems in depth</w:t>
       </w:r>
       <w:r>
         <w:rPr>
@@ -3901,7 +3901,7 @@
           <w:b/>
           <w:bCs/>
         </w:rPr>
-        <w:t xml:space="preserve">Georeferencing is covered step by step in Session 3.</w:t>
+        <w:t xml:space="preserve">Georeferencing is covered step by step in Session 4.</w:t>
       </w:r>
     </w:p>
     <w:p>
@@ -4244,7 +4244,7 @@
         </w:rPr>
         <w:t xml:space="preserve">All the data for this course is on the course page on GitHub: </w:t>
       </w:r>
-      <w:hyperlink w:history="1" r:id="rId0xjxp3xbu49mn32q1fxrn">
+      <w:hyperlink w:history="1" r:id="rIdok4wr8tb8d5jzaob-bdva">
         <w:r>
           <w:rPr>
             <w:rStyle w:val="Hyperlink"/>
@@ -4273,7 +4273,7 @@
         </w:rPr>
         <w:t xml:space="preserve"> (6.8 MB): </w:t>
       </w:r>
-      <w:hyperlink w:history="1" r:id="rIdy1fmmrx391ratvlfaliwn">
+      <w:hyperlink w:history="1" r:id="rId-mvtvui0ekxoyeirnltfn">
         <w:r>
           <w:rPr>
             <w:rStyle w:val="Hyperlink"/>
@@ -4314,7 +4314,7 @@
         </w:rPr>
         <w:t xml:space="preserve">The practicals and data are also published on the Zimgeo training page: </w:t>
       </w:r>
-      <w:hyperlink w:history="1" r:id="rId142kd71onenckpr2tpowd">
+      <w:hyperlink w:history="1" r:id="rId75mn1v3zwb_rqklrly_jj">
         <w:r>
           <w:rPr>
             <w:rStyle w:val="Hyperlink"/>
@@ -10915,7 +10915,7 @@
         </w:rPr>
         <w:t xml:space="preserve">The plugin is on its own page on GitHub: </w:t>
       </w:r>
-      <w:hyperlink w:history="1" r:id="rIdyhrxbm4jvzf6fv6zqcgs8">
+      <w:hyperlink w:history="1" r:id="rIdq9pdjwii3n29-qgpxxjle">
         <w:r>
           <w:rPr>
             <w:rStyle w:val="Hyperlink"/>
@@ -11176,7 +11176,7 @@
         </w:rPr>
         <w:t xml:space="preserve">Direct download link: </w:t>
       </w:r>
-      <w:hyperlink w:history="1" r:id="rIdncaf6erofckbdch6-wyvs">
+      <w:hyperlink w:history="1" r:id="rId7jxe1g37deu7zdhkow8le">
         <w:r>
           <w:rPr>
             <w:rStyle w:val="Hyperlink"/>
@@ -12348,13 +12348,13 @@
           <w:b/>
           <w:bCs/>
         </w:rPr>
-        <w:t xml:space="preserve">Session 3: Georeferencing.</w:t>
-      </w:r>
-      <w:r>
-        <w:rPr>
-          <w:rFonts w:ascii="Times New Roman" w:cs="Times New Roman" w:eastAsia="Times New Roman" w:hAnsi="Times New Roman"/>
-        </w:rPr>
-        <w:t xml:space="preserve"> You will take a scanned map, add ground control points and turn it into a GeoTIFF that lines up with the data you used today.</w:t>
+        <w:t xml:space="preserve">Session 3: Coordinate systems.</w:t>
+      </w:r>
+      <w:r>
+        <w:rPr>
+          <w:rFonts w:ascii="Times New Roman" w:cs="Times New Roman" w:eastAsia="Times New Roman" w:hAnsi="Times New Roman"/>
+        </w:rPr>
+        <w:t xml:space="preserve"> You will look more closely at geographic and projected coordinate systems, UTM zones 35S and 36S, datums, and how to reproject layers so that distances and areas are correct.</w:t>
       </w:r>
     </w:p>
     <w:p>
@@ -12368,13 +12368,13 @@
           <w:b/>
           <w:bCs/>
         </w:rPr>
-        <w:t xml:space="preserve">Session 4: Coordinate systems.</w:t>
-      </w:r>
-      <w:r>
-        <w:rPr>
-          <w:rFonts w:ascii="Times New Roman" w:cs="Times New Roman" w:eastAsia="Times New Roman" w:hAnsi="Times New Roman"/>
-        </w:rPr>
-        <w:t xml:space="preserve"> You will look more closely at geographic and projected coordinate systems, UTM zones 35S and 36S, datums, and how to reproject layers so that distances and areas are correct.</w:t>
+        <w:t xml:space="preserve">Session 4: Georeferencing.</w:t>
+      </w:r>
+      <w:r>
+        <w:rPr>
+          <w:rFonts w:ascii="Times New Roman" w:cs="Times New Roman" w:eastAsia="Times New Roman" w:hAnsi="Times New Roman"/>
+        </w:rPr>
+        <w:t xml:space="preserve"> You will take a scanned map, add ground control points and turn it into a GeoTIFF that lines up with your other layers in the correct coordinate system.</w:t>
       </w:r>
     </w:p>
     <w:p>
@@ -12394,7 +12394,7 @@
         <w:rPr>
           <w:rFonts w:ascii="Times New Roman" w:cs="Times New Roman" w:eastAsia="Times New Roman" w:hAnsi="Times New Roman"/>
         </w:rPr>
-        <w:t xml:space="preserve"> You will collect your own data in the field with GPS and a mobile data collection app, and bring it into QGIS.</w:t>
+        <w:t xml:space="preserve"> You will collect your own data in the field with GPS and a mobile data collection app, bring it into QGIS and overlay it on the maps you georeferenced in Session 4.</w:t>
       </w:r>
     </w:p>
     <w:p>
@@ -12428,7 +12428,7 @@
         </w:rPr>
         <w:t xml:space="preserve">Course information, updates and the Practical 1 data are on the Zimgeo training page, </w:t>
       </w:r>
-      <w:hyperlink w:history="1" r:id="rIdpvbkp0hjpinsaz3_euca0">
+      <w:hyperlink w:history="1" r:id="rIdgirxj4kbl4omdck6ejy6n">
         <w:r>
           <w:rPr>
             <w:rStyle w:val="Hyperlink"/>
@@ -12443,7 +12443,7 @@
         </w:rPr>
         <w:t xml:space="preserve">, and on the course page on GitHub, </w:t>
       </w:r>
-      <w:hyperlink w:history="1" r:id="rIdgmecasffk4zp5a0zrcwqk">
+      <w:hyperlink w:history="1" r:id="rId37b0ct2zse4oy3qbiezt7">
         <w:r>
           <w:rPr>
             <w:rStyle w:val="Hyperlink"/>
@@ -12458,7 +12458,7 @@
         </w:rPr>
         <w:t xml:space="preserve">. For questions, contact the Zimgeo team at </w:t>
       </w:r>
-      <w:hyperlink w:history="1" r:id="rIdwadpahuvynzywb2msaj2u">
+      <w:hyperlink w:history="1" r:id="rIdij5z9bs3d5uublmcw0rvg">
         <w:r>
           <w:rPr>
             <w:rStyle w:val="Hyperlink"/>
@@ -12473,7 +12473,7 @@
         </w:rPr>
         <w:t xml:space="preserve"> or </w:t>
       </w:r>
-      <w:hyperlink w:history="1" r:id="rIdmnypsc7ytbmpw--usgx9d">
+      <w:hyperlink w:history="1" r:id="rIdnmvlqjxfa6exg6ui_rxq3">
         <w:r>
           <w:rPr>
             <w:rStyle w:val="Hyperlink"/>

</xml_diff>